<commit_message>
Final Final Pro +
Everything is ready.
</commit_message>
<xml_diff>
--- a/opencl/RandomNumberGeneration/Random Number Generation.docx
+++ b/opencl/RandomNumberGeneration/Random Number Generation.docx
@@ -1,6 +1,6 @@
 
 <file path=word/document.xml><?xml version="1.0" encoding="utf-8"?>
-<w:document xmlns:wpc="http://schemas.microsoft.com/office/word/2010/wordprocessingCanvas" xmlns:cx="http://schemas.microsoft.com/office/drawing/2014/chartex" xmlns:cx1="http://schemas.microsoft.com/office/drawing/2015/9/8/chartex" xmlns:cx2="http://schemas.microsoft.com/office/drawing/2015/10/21/chartex" xmlns:cx3="http://schemas.microsoft.com/office/drawing/2016/5/9/chartex" xmlns:cx4="http://schemas.microsoft.com/office/drawing/2016/5/10/chartex" xmlns:cx5="http://schemas.microsoft.com/office/drawing/2016/5/11/chartex" xmlns:cx6="http://schemas.microsoft.com/office/drawing/2016/5/12/chartex" xmlns:cx7="http://schemas.microsoft.com/office/drawing/2016/5/13/chartex" xmlns:cx8="http://schemas.microsoft.com/office/drawing/2016/5/14/chartex" xmlns:mc="http://schemas.openxmlformats.org/markup-compatibility/2006" xmlns:aink="http://schemas.microsoft.com/office/drawing/2016/ink" xmlns:am3d="http://schemas.microsoft.com/office/drawing/2017/model3d" xmlns:o="urn:schemas-microsoft-com:office:office" xmlns:oel="http://schemas.microsoft.com/office/2019/extlst" xmlns:r="http://schemas.openxmlformats.org/officeDocument/2006/relationships" xmlns:m="http://schemas.openxmlformats.org/officeDocument/2006/math" xmlns:v="urn:schemas-microsoft-com:vml" xmlns:wp14="http://schemas.microsoft.com/office/word/2010/wordprocessingDrawing" xmlns:wp="http://schemas.openxmlformats.org/drawingml/2006/wordprocessingDrawing" xmlns:w10="urn:schemas-microsoft-com:office:word" xmlns:w="http://schemas.openxmlformats.org/wordprocessingml/2006/main" xmlns:w14="http://schemas.microsoft.com/office/word/2010/wordml" xmlns:w15="http://schemas.microsoft.com/office/word/2012/wordml" xmlns:w16cex="http://schemas.microsoft.com/office/word/2018/wordml/cex" xmlns:w16cid="http://schemas.microsoft.com/office/word/2016/wordml/cid" xmlns:w16="http://schemas.microsoft.com/office/word/2018/wordml" xmlns:w16sdtdh="http://schemas.microsoft.com/office/word/2020/wordml/sdtdatahash" xmlns:w16se="http://schemas.microsoft.com/office/word/2015/wordml/symex" xmlns:wpg="http://schemas.microsoft.com/office/word/2010/wordprocessingGroup" xmlns:wpi="http://schemas.microsoft.com/office/word/2010/wordprocessingInk" xmlns:wne="http://schemas.microsoft.com/office/word/2006/wordml" xmlns:wps="http://schemas.microsoft.com/office/word/2010/wordprocessingShape" mc:Ignorable="w14 w15 w16se w16cid w16 w16cex w16sdtdh wp14">
+<w:document xmlns:wpc="http://schemas.microsoft.com/office/word/2010/wordprocessingCanvas" xmlns:cx="http://schemas.microsoft.com/office/drawing/2014/chartex" xmlns:cx1="http://schemas.microsoft.com/office/drawing/2015/9/8/chartex" xmlns:cx2="http://schemas.microsoft.com/office/drawing/2015/10/21/chartex" xmlns:cx3="http://schemas.microsoft.com/office/drawing/2016/5/9/chartex" xmlns:cx4="http://schemas.microsoft.com/office/drawing/2016/5/10/chartex" xmlns:cx5="http://schemas.microsoft.com/office/drawing/2016/5/11/chartex" xmlns:cx6="http://schemas.microsoft.com/office/drawing/2016/5/12/chartex" xmlns:cx7="http://schemas.microsoft.com/office/drawing/2016/5/13/chartex" xmlns:cx8="http://schemas.microsoft.com/office/drawing/2016/5/14/chartex" xmlns:mc="http://schemas.openxmlformats.org/markup-compatibility/2006" xmlns:aink="http://schemas.microsoft.com/office/drawing/2016/ink" xmlns:am3d="http://schemas.microsoft.com/office/drawing/2017/model3d" xmlns:o="urn:schemas-microsoft-com:office:office" xmlns:oel="http://schemas.microsoft.com/office/2019/extlst" xmlns:r="http://schemas.openxmlformats.org/officeDocument/2006/relationships" xmlns:m="http://schemas.openxmlformats.org/officeDocument/2006/math" xmlns:v="urn:schemas-microsoft-com:vml" xmlns:wp14="http://schemas.microsoft.com/office/word/2010/wordprocessingDrawing" xmlns:wp="http://schemas.openxmlformats.org/drawingml/2006/wordprocessingDrawing" xmlns:w10="urn:schemas-microsoft-com:office:word" xmlns:w="http://schemas.openxmlformats.org/wordprocessingml/2006/main" xmlns:w14="http://schemas.microsoft.com/office/word/2010/wordml" xmlns:w15="http://schemas.microsoft.com/office/word/2012/wordml" xmlns:w16cex="http://schemas.microsoft.com/office/word/2018/wordml/cex" xmlns:w16cid="http://schemas.microsoft.com/office/word/2016/wordml/cid" xmlns:w16="http://schemas.microsoft.com/office/word/2018/wordml" xmlns:w16sdtdh="http://schemas.microsoft.com/office/word/2020/wordml/sdtdatahash" xmlns:w16se="http://schemas.microsoft.com/office/word/2015/wordml/symex" xmlns:wpg="http://schemas.microsoft.com/office/word/2010/wordprocessingGroup" xmlns:wpi="http://schemas.microsoft.com/office/word/2010/wordprocessingInk" xmlns:wne="http://schemas.microsoft.com/office/word/2006/wordml" xmlns:wps="http://schemas.microsoft.com/office/word/2010/wordprocessingShape" xmlns:a="http://schemas.openxmlformats.org/drawingml/2006/main" xmlns:pic="http://schemas.openxmlformats.org/drawingml/2006/picture" xmlns:a14="http://schemas.microsoft.com/office/drawing/2010/main" mc:Ignorable="w14 w15 w16se w16cid w16 w16cex w16sdtdh wp14">
   <w:body>
     <w:p>
       <w:pPr>
@@ -47,7 +47,7 @@
           <w:tab w:val="right" w:pos="9062"/>
         </w:tabs>
         <w:rPr>
-          <w:rFonts w:asciiTheme="minorHAnsi" w:eastAsiaTheme="minorEastAsia" w:hAnsiTheme="minorHAnsi" w:cstheme="minorBidi"/>
+          <w:rFonts w:asciiTheme="minorHAnsi" w:hAnsiTheme="minorHAnsi" w:eastAsiaTheme="minorEastAsia" w:cstheme="minorBidi"/>
           <w:b w:val="0"/>
           <w:bCs w:val="0"/>
           <w:caps w:val="0"/>
@@ -74,7 +74,7 @@
         </w:rPr>
         <w:fldChar w:fldCharType="separate"/>
       </w:r>
-      <w:hyperlink w:anchor="_Toc233543052" w:history="1">
+      <w:hyperlink w:history="1" w:anchor="_Toc233543052">
         <w:r>
           <w:rPr>
             <w:rStyle w:val="Hiperhivatkozs"/>
@@ -85,7 +85,7 @@
         </w:r>
         <w:r>
           <w:rPr>
-            <w:rFonts w:asciiTheme="minorHAnsi" w:eastAsiaTheme="minorEastAsia" w:hAnsiTheme="minorHAnsi" w:cstheme="minorBidi"/>
+            <w:rFonts w:asciiTheme="minorHAnsi" w:hAnsiTheme="minorHAnsi" w:eastAsiaTheme="minorEastAsia" w:cstheme="minorBidi"/>
             <w:b w:val="0"/>
             <w:bCs w:val="0"/>
             <w:caps w:val="0"/>
@@ -161,7 +161,7 @@
           <w:tab w:val="right" w:pos="9062"/>
         </w:tabs>
         <w:rPr>
-          <w:rFonts w:asciiTheme="minorHAnsi" w:eastAsiaTheme="minorEastAsia" w:hAnsiTheme="minorHAnsi" w:cstheme="minorBidi"/>
+          <w:rFonts w:asciiTheme="minorHAnsi" w:hAnsiTheme="minorHAnsi" w:eastAsiaTheme="minorEastAsia" w:cstheme="minorBidi"/>
           <w:b w:val="0"/>
           <w:bCs w:val="0"/>
           <w:smallCaps w:val="0"/>
@@ -169,7 +169,7 @@
           <w:lang w:eastAsia="hu-HU"/>
         </w:rPr>
       </w:pPr>
-      <w:hyperlink w:anchor="_Toc233543053" w:history="1">
+      <w:hyperlink w:history="1" w:anchor="_Toc233543053">
         <w:r>
           <w:rPr>
             <w:rStyle w:val="Hiperhivatkozs"/>
@@ -180,7 +180,7 @@
         </w:r>
         <w:r>
           <w:rPr>
-            <w:rFonts w:asciiTheme="minorHAnsi" w:eastAsiaTheme="minorEastAsia" w:hAnsiTheme="minorHAnsi" w:cstheme="minorBidi"/>
+            <w:rFonts w:asciiTheme="minorHAnsi" w:hAnsiTheme="minorHAnsi" w:eastAsiaTheme="minorEastAsia" w:cstheme="minorBidi"/>
             <w:b w:val="0"/>
             <w:bCs w:val="0"/>
             <w:smallCaps w:val="0"/>
@@ -255,7 +255,7 @@
           <w:tab w:val="right" w:pos="9062"/>
         </w:tabs>
         <w:rPr>
-          <w:rFonts w:asciiTheme="minorHAnsi" w:eastAsiaTheme="minorEastAsia" w:hAnsiTheme="minorHAnsi" w:cstheme="minorBidi"/>
+          <w:rFonts w:asciiTheme="minorHAnsi" w:hAnsiTheme="minorHAnsi" w:eastAsiaTheme="minorEastAsia" w:cstheme="minorBidi"/>
           <w:b w:val="0"/>
           <w:bCs w:val="0"/>
           <w:caps w:val="0"/>
@@ -264,7 +264,7 @@
           <w:lang w:eastAsia="hu-HU"/>
         </w:rPr>
       </w:pPr>
-      <w:hyperlink w:anchor="_Toc233543054" w:history="1">
+      <w:hyperlink w:history="1" w:anchor="_Toc233543054">
         <w:r>
           <w:rPr>
             <w:rStyle w:val="Hiperhivatkozs"/>
@@ -275,7 +275,7 @@
         </w:r>
         <w:r>
           <w:rPr>
-            <w:rFonts w:asciiTheme="minorHAnsi" w:eastAsiaTheme="minorEastAsia" w:hAnsiTheme="minorHAnsi" w:cstheme="minorBidi"/>
+            <w:rFonts w:asciiTheme="minorHAnsi" w:hAnsiTheme="minorHAnsi" w:eastAsiaTheme="minorEastAsia" w:cstheme="minorBidi"/>
             <w:b w:val="0"/>
             <w:bCs w:val="0"/>
             <w:caps w:val="0"/>
@@ -351,7 +351,7 @@
           <w:tab w:val="right" w:pos="9062"/>
         </w:tabs>
         <w:rPr>
-          <w:rFonts w:asciiTheme="minorHAnsi" w:eastAsiaTheme="minorEastAsia" w:hAnsiTheme="minorHAnsi" w:cstheme="minorBidi"/>
+          <w:rFonts w:asciiTheme="minorHAnsi" w:hAnsiTheme="minorHAnsi" w:eastAsiaTheme="minorEastAsia" w:cstheme="minorBidi"/>
           <w:b w:val="0"/>
           <w:bCs w:val="0"/>
           <w:smallCaps w:val="0"/>
@@ -359,7 +359,7 @@
           <w:lang w:eastAsia="hu-HU"/>
         </w:rPr>
       </w:pPr>
-      <w:hyperlink w:anchor="_Toc233543055" w:history="1">
+      <w:hyperlink w:history="1" w:anchor="_Toc233543055">
         <w:r>
           <w:rPr>
             <w:rStyle w:val="Hiperhivatkozs"/>
@@ -370,7 +370,7 @@
         </w:r>
         <w:r>
           <w:rPr>
-            <w:rFonts w:asciiTheme="minorHAnsi" w:eastAsiaTheme="minorEastAsia" w:hAnsiTheme="minorHAnsi" w:cstheme="minorBidi"/>
+            <w:rFonts w:asciiTheme="minorHAnsi" w:hAnsiTheme="minorHAnsi" w:eastAsiaTheme="minorEastAsia" w:cstheme="minorBidi"/>
             <w:b w:val="0"/>
             <w:bCs w:val="0"/>
             <w:smallCaps w:val="0"/>
@@ -445,7 +445,7 @@
           <w:tab w:val="right" w:pos="9062"/>
         </w:tabs>
         <w:rPr>
-          <w:rFonts w:asciiTheme="minorHAnsi" w:eastAsiaTheme="minorEastAsia" w:hAnsiTheme="minorHAnsi" w:cstheme="minorBidi"/>
+          <w:rFonts w:asciiTheme="minorHAnsi" w:hAnsiTheme="minorHAnsi" w:eastAsiaTheme="minorEastAsia" w:cstheme="minorBidi"/>
           <w:b w:val="0"/>
           <w:bCs w:val="0"/>
           <w:smallCaps w:val="0"/>
@@ -453,7 +453,7 @@
           <w:lang w:eastAsia="hu-HU"/>
         </w:rPr>
       </w:pPr>
-      <w:hyperlink w:anchor="_Toc233543056" w:history="1">
+      <w:hyperlink w:history="1" w:anchor="_Toc233543056">
         <w:r>
           <w:rPr>
             <w:rStyle w:val="Hiperhivatkozs"/>
@@ -464,7 +464,7 @@
         </w:r>
         <w:r>
           <w:rPr>
-            <w:rFonts w:asciiTheme="minorHAnsi" w:eastAsiaTheme="minorEastAsia" w:hAnsiTheme="minorHAnsi" w:cstheme="minorBidi"/>
+            <w:rFonts w:asciiTheme="minorHAnsi" w:hAnsiTheme="minorHAnsi" w:eastAsiaTheme="minorEastAsia" w:cstheme="minorBidi"/>
             <w:b w:val="0"/>
             <w:bCs w:val="0"/>
             <w:smallCaps w:val="0"/>
@@ -539,7 +539,7 @@
           <w:tab w:val="right" w:pos="9062"/>
         </w:tabs>
         <w:rPr>
-          <w:rFonts w:asciiTheme="minorHAnsi" w:eastAsiaTheme="minorEastAsia" w:hAnsiTheme="minorHAnsi" w:cstheme="minorBidi"/>
+          <w:rFonts w:asciiTheme="minorHAnsi" w:hAnsiTheme="minorHAnsi" w:eastAsiaTheme="minorEastAsia" w:cstheme="minorBidi"/>
           <w:b w:val="0"/>
           <w:bCs w:val="0"/>
           <w:smallCaps w:val="0"/>
@@ -547,7 +547,7 @@
           <w:lang w:eastAsia="hu-HU"/>
         </w:rPr>
       </w:pPr>
-      <w:hyperlink w:anchor="_Toc233543057" w:history="1">
+      <w:hyperlink w:history="1" w:anchor="_Toc233543057">
         <w:r>
           <w:rPr>
             <w:rStyle w:val="Hiperhivatkozs"/>
@@ -558,7 +558,7 @@
         </w:r>
         <w:r>
           <w:rPr>
-            <w:rFonts w:asciiTheme="minorHAnsi" w:eastAsiaTheme="minorEastAsia" w:hAnsiTheme="minorHAnsi" w:cstheme="minorBidi"/>
+            <w:rFonts w:asciiTheme="minorHAnsi" w:hAnsiTheme="minorHAnsi" w:eastAsiaTheme="minorEastAsia" w:cstheme="minorBidi"/>
             <w:b w:val="0"/>
             <w:bCs w:val="0"/>
             <w:smallCaps w:val="0"/>
@@ -633,7 +633,7 @@
           <w:tab w:val="right" w:pos="9062"/>
         </w:tabs>
         <w:rPr>
-          <w:rFonts w:asciiTheme="minorHAnsi" w:eastAsiaTheme="minorEastAsia" w:hAnsiTheme="minorHAnsi" w:cstheme="minorBidi"/>
+          <w:rFonts w:asciiTheme="minorHAnsi" w:hAnsiTheme="minorHAnsi" w:eastAsiaTheme="minorEastAsia" w:cstheme="minorBidi"/>
           <w:b w:val="0"/>
           <w:bCs w:val="0"/>
           <w:smallCaps w:val="0"/>
@@ -641,7 +641,7 @@
           <w:lang w:eastAsia="hu-HU"/>
         </w:rPr>
       </w:pPr>
-      <w:hyperlink w:anchor="_Toc233543058" w:history="1">
+      <w:hyperlink w:history="1" w:anchor="_Toc233543058">
         <w:r>
           <w:rPr>
             <w:rStyle w:val="Hiperhivatkozs"/>
@@ -651,7 +651,7 @@
         </w:r>
         <w:r>
           <w:rPr>
-            <w:rFonts w:asciiTheme="minorHAnsi" w:eastAsiaTheme="minorEastAsia" w:hAnsiTheme="minorHAnsi" w:cstheme="minorBidi"/>
+            <w:rFonts w:asciiTheme="minorHAnsi" w:hAnsiTheme="minorHAnsi" w:eastAsiaTheme="minorEastAsia" w:cstheme="minorBidi"/>
             <w:b w:val="0"/>
             <w:bCs w:val="0"/>
             <w:smallCaps w:val="0"/>
@@ -725,7 +725,7 @@
           <w:tab w:val="right" w:pos="9062"/>
         </w:tabs>
         <w:rPr>
-          <w:rFonts w:asciiTheme="minorHAnsi" w:eastAsiaTheme="minorEastAsia" w:hAnsiTheme="minorHAnsi" w:cstheme="minorBidi"/>
+          <w:rFonts w:asciiTheme="minorHAnsi" w:hAnsiTheme="minorHAnsi" w:eastAsiaTheme="minorEastAsia" w:cstheme="minorBidi"/>
           <w:b w:val="0"/>
           <w:bCs w:val="0"/>
           <w:smallCaps w:val="0"/>
@@ -733,7 +733,7 @@
           <w:lang w:eastAsia="hu-HU"/>
         </w:rPr>
       </w:pPr>
-      <w:hyperlink w:anchor="_Toc233543059" w:history="1">
+      <w:hyperlink w:history="1" w:anchor="_Toc233543059">
         <w:r>
           <w:rPr>
             <w:rStyle w:val="Hiperhivatkozs"/>
@@ -744,7 +744,7 @@
         </w:r>
         <w:r>
           <w:rPr>
-            <w:rFonts w:asciiTheme="minorHAnsi" w:eastAsiaTheme="minorEastAsia" w:hAnsiTheme="minorHAnsi" w:cstheme="minorBidi"/>
+            <w:rFonts w:asciiTheme="minorHAnsi" w:hAnsiTheme="minorHAnsi" w:eastAsiaTheme="minorEastAsia" w:cstheme="minorBidi"/>
             <w:b w:val="0"/>
             <w:bCs w:val="0"/>
             <w:smallCaps w:val="0"/>
@@ -819,7 +819,7 @@
           <w:tab w:val="right" w:pos="9062"/>
         </w:tabs>
         <w:rPr>
-          <w:rFonts w:asciiTheme="minorHAnsi" w:eastAsiaTheme="minorEastAsia" w:hAnsiTheme="minorHAnsi" w:cstheme="minorBidi"/>
+          <w:rFonts w:asciiTheme="minorHAnsi" w:hAnsiTheme="minorHAnsi" w:eastAsiaTheme="minorEastAsia" w:cstheme="minorBidi"/>
           <w:b w:val="0"/>
           <w:bCs w:val="0"/>
           <w:caps w:val="0"/>
@@ -828,7 +828,7 @@
           <w:lang w:eastAsia="hu-HU"/>
         </w:rPr>
       </w:pPr>
-      <w:hyperlink w:anchor="_Toc233543060" w:history="1">
+      <w:hyperlink w:history="1" w:anchor="_Toc233543060">
         <w:r>
           <w:rPr>
             <w:rStyle w:val="Hiperhivatkozs"/>
@@ -839,7 +839,7 @@
         </w:r>
         <w:r>
           <w:rPr>
-            <w:rFonts w:asciiTheme="minorHAnsi" w:eastAsiaTheme="minorEastAsia" w:hAnsiTheme="minorHAnsi" w:cstheme="minorBidi"/>
+            <w:rFonts w:asciiTheme="minorHAnsi" w:hAnsiTheme="minorHAnsi" w:eastAsiaTheme="minorEastAsia" w:cstheme="minorBidi"/>
             <w:b w:val="0"/>
             <w:bCs w:val="0"/>
             <w:caps w:val="0"/>
@@ -915,7 +915,7 @@
           <w:tab w:val="right" w:pos="9062"/>
         </w:tabs>
         <w:rPr>
-          <w:rFonts w:asciiTheme="minorHAnsi" w:eastAsiaTheme="minorEastAsia" w:hAnsiTheme="minorHAnsi" w:cstheme="minorBidi"/>
+          <w:rFonts w:asciiTheme="minorHAnsi" w:hAnsiTheme="minorHAnsi" w:eastAsiaTheme="minorEastAsia" w:cstheme="minorBidi"/>
           <w:b w:val="0"/>
           <w:bCs w:val="0"/>
           <w:smallCaps w:val="0"/>
@@ -923,7 +923,7 @@
           <w:lang w:eastAsia="hu-HU"/>
         </w:rPr>
       </w:pPr>
-      <w:hyperlink w:anchor="_Toc233543061" w:history="1">
+      <w:hyperlink w:history="1" w:anchor="_Toc233543061">
         <w:r>
           <w:rPr>
             <w:rStyle w:val="Hiperhivatkozs"/>
@@ -934,7 +934,7 @@
         </w:r>
         <w:r>
           <w:rPr>
-            <w:rFonts w:asciiTheme="minorHAnsi" w:eastAsiaTheme="minorEastAsia" w:hAnsiTheme="minorHAnsi" w:cstheme="minorBidi"/>
+            <w:rFonts w:asciiTheme="minorHAnsi" w:hAnsiTheme="minorHAnsi" w:eastAsiaTheme="minorEastAsia" w:cstheme="minorBidi"/>
             <w:b w:val="0"/>
             <w:bCs w:val="0"/>
             <w:smallCaps w:val="0"/>
@@ -1009,7 +1009,7 @@
           <w:tab w:val="right" w:pos="9062"/>
         </w:tabs>
         <w:rPr>
-          <w:rFonts w:asciiTheme="minorHAnsi" w:eastAsiaTheme="minorEastAsia" w:hAnsiTheme="minorHAnsi" w:cstheme="minorBidi"/>
+          <w:rFonts w:asciiTheme="minorHAnsi" w:hAnsiTheme="minorHAnsi" w:eastAsiaTheme="minorEastAsia" w:cstheme="minorBidi"/>
           <w:b w:val="0"/>
           <w:bCs w:val="0"/>
           <w:smallCaps w:val="0"/>
@@ -1017,7 +1017,7 @@
           <w:lang w:eastAsia="hu-HU"/>
         </w:rPr>
       </w:pPr>
-      <w:hyperlink w:anchor="_Toc233543062" w:history="1">
+      <w:hyperlink w:history="1" w:anchor="_Toc233543062">
         <w:r>
           <w:rPr>
             <w:rStyle w:val="Hiperhivatkozs"/>
@@ -1028,7 +1028,7 @@
         </w:r>
         <w:r>
           <w:rPr>
-            <w:rFonts w:asciiTheme="minorHAnsi" w:eastAsiaTheme="minorEastAsia" w:hAnsiTheme="minorHAnsi" w:cstheme="minorBidi"/>
+            <w:rFonts w:asciiTheme="minorHAnsi" w:hAnsiTheme="minorHAnsi" w:eastAsiaTheme="minorEastAsia" w:cstheme="minorBidi"/>
             <w:b w:val="0"/>
             <w:bCs w:val="0"/>
             <w:smallCaps w:val="0"/>
@@ -1103,7 +1103,7 @@
           <w:tab w:val="right" w:pos="9062"/>
         </w:tabs>
         <w:rPr>
-          <w:rFonts w:asciiTheme="minorHAnsi" w:eastAsiaTheme="minorEastAsia" w:hAnsiTheme="minorHAnsi" w:cstheme="minorBidi"/>
+          <w:rFonts w:asciiTheme="minorHAnsi" w:hAnsiTheme="minorHAnsi" w:eastAsiaTheme="minorEastAsia" w:cstheme="minorBidi"/>
           <w:b w:val="0"/>
           <w:bCs w:val="0"/>
           <w:smallCaps w:val="0"/>
@@ -1111,7 +1111,7 @@
           <w:lang w:eastAsia="hu-HU"/>
         </w:rPr>
       </w:pPr>
-      <w:hyperlink w:anchor="_Toc233543063" w:history="1">
+      <w:hyperlink w:history="1" w:anchor="_Toc233543063">
         <w:r>
           <w:rPr>
             <w:rStyle w:val="Hiperhivatkozs"/>
@@ -1122,7 +1122,7 @@
         </w:r>
         <w:r>
           <w:rPr>
-            <w:rFonts w:asciiTheme="minorHAnsi" w:eastAsiaTheme="minorEastAsia" w:hAnsiTheme="minorHAnsi" w:cstheme="minorBidi"/>
+            <w:rFonts w:asciiTheme="minorHAnsi" w:hAnsiTheme="minorHAnsi" w:eastAsiaTheme="minorEastAsia" w:cstheme="minorBidi"/>
             <w:b w:val="0"/>
             <w:bCs w:val="0"/>
             <w:smallCaps w:val="0"/>
@@ -1197,7 +1197,7 @@
           <w:tab w:val="right" w:pos="9062"/>
         </w:tabs>
         <w:rPr>
-          <w:rFonts w:asciiTheme="minorHAnsi" w:eastAsiaTheme="minorEastAsia" w:hAnsiTheme="minorHAnsi" w:cstheme="minorBidi"/>
+          <w:rFonts w:asciiTheme="minorHAnsi" w:hAnsiTheme="minorHAnsi" w:eastAsiaTheme="minorEastAsia" w:cstheme="minorBidi"/>
           <w:b w:val="0"/>
           <w:bCs w:val="0"/>
           <w:caps w:val="0"/>
@@ -1206,7 +1206,7 @@
           <w:lang w:eastAsia="hu-HU"/>
         </w:rPr>
       </w:pPr>
-      <w:hyperlink w:anchor="_Toc233543064" w:history="1">
+      <w:hyperlink w:history="1" w:anchor="_Toc233543064">
         <w:r>
           <w:rPr>
             <w:rStyle w:val="Hiperhivatkozs"/>
@@ -1217,7 +1217,7 @@
         </w:r>
         <w:r>
           <w:rPr>
-            <w:rFonts w:asciiTheme="minorHAnsi" w:eastAsiaTheme="minorEastAsia" w:hAnsiTheme="minorHAnsi" w:cstheme="minorBidi"/>
+            <w:rFonts w:asciiTheme="minorHAnsi" w:hAnsiTheme="minorHAnsi" w:eastAsiaTheme="minorEastAsia" w:cstheme="minorBidi"/>
             <w:b w:val="0"/>
             <w:bCs w:val="0"/>
             <w:caps w:val="0"/>
@@ -1293,7 +1293,7 @@
           <w:tab w:val="right" w:pos="9062"/>
         </w:tabs>
         <w:rPr>
-          <w:rFonts w:asciiTheme="minorHAnsi" w:eastAsiaTheme="minorEastAsia" w:hAnsiTheme="minorHAnsi" w:cstheme="minorBidi"/>
+          <w:rFonts w:asciiTheme="minorHAnsi" w:hAnsiTheme="minorHAnsi" w:eastAsiaTheme="minorEastAsia" w:cstheme="minorBidi"/>
           <w:b w:val="0"/>
           <w:bCs w:val="0"/>
           <w:caps w:val="0"/>
@@ -1302,7 +1302,7 @@
           <w:lang w:eastAsia="hu-HU"/>
         </w:rPr>
       </w:pPr>
-      <w:hyperlink w:anchor="_Toc233543065" w:history="1">
+      <w:hyperlink w:history="1" w:anchor="_Toc233543065">
         <w:r>
           <w:rPr>
             <w:rStyle w:val="Hiperhivatkozs"/>
@@ -1313,7 +1313,7 @@
         </w:r>
         <w:r>
           <w:rPr>
-            <w:rFonts w:asciiTheme="minorHAnsi" w:eastAsiaTheme="minorEastAsia" w:hAnsiTheme="minorHAnsi" w:cstheme="minorBidi"/>
+            <w:rFonts w:asciiTheme="minorHAnsi" w:hAnsiTheme="minorHAnsi" w:eastAsiaTheme="minorEastAsia" w:cstheme="minorBidi"/>
             <w:b w:val="0"/>
             <w:bCs w:val="0"/>
             <w:caps w:val="0"/>
@@ -1389,7 +1389,7 @@
           <w:tab w:val="right" w:pos="9062"/>
         </w:tabs>
         <w:rPr>
-          <w:rFonts w:asciiTheme="minorHAnsi" w:eastAsiaTheme="minorEastAsia" w:hAnsiTheme="minorHAnsi" w:cstheme="minorBidi"/>
+          <w:rFonts w:asciiTheme="minorHAnsi" w:hAnsiTheme="minorHAnsi" w:eastAsiaTheme="minorEastAsia" w:cstheme="minorBidi"/>
           <w:b w:val="0"/>
           <w:bCs w:val="0"/>
           <w:smallCaps w:val="0"/>
@@ -1397,7 +1397,7 @@
           <w:lang w:eastAsia="hu-HU"/>
         </w:rPr>
       </w:pPr>
-      <w:hyperlink w:anchor="_Toc233543066" w:history="1">
+      <w:hyperlink w:history="1" w:anchor="_Toc233543066">
         <w:r>
           <w:rPr>
             <w:rStyle w:val="Hiperhivatkozs"/>
@@ -1408,7 +1408,7 @@
         </w:r>
         <w:r>
           <w:rPr>
-            <w:rFonts w:asciiTheme="minorHAnsi" w:eastAsiaTheme="minorEastAsia" w:hAnsiTheme="minorHAnsi" w:cstheme="minorBidi"/>
+            <w:rFonts w:asciiTheme="minorHAnsi" w:hAnsiTheme="minorHAnsi" w:eastAsiaTheme="minorEastAsia" w:cstheme="minorBidi"/>
             <w:b w:val="0"/>
             <w:bCs w:val="0"/>
             <w:smallCaps w:val="0"/>
@@ -1483,7 +1483,7 @@
           <w:tab w:val="right" w:pos="9062"/>
         </w:tabs>
         <w:rPr>
-          <w:rFonts w:asciiTheme="minorHAnsi" w:eastAsiaTheme="minorEastAsia" w:hAnsiTheme="minorHAnsi" w:cstheme="minorBidi"/>
+          <w:rFonts w:asciiTheme="minorHAnsi" w:hAnsiTheme="minorHAnsi" w:eastAsiaTheme="minorEastAsia" w:cstheme="minorBidi"/>
           <w:b w:val="0"/>
           <w:bCs w:val="0"/>
           <w:smallCaps w:val="0"/>
@@ -1491,7 +1491,7 @@
           <w:lang w:eastAsia="hu-HU"/>
         </w:rPr>
       </w:pPr>
-      <w:hyperlink w:anchor="_Toc233543067" w:history="1">
+      <w:hyperlink w:history="1" w:anchor="_Toc233543067">
         <w:r>
           <w:rPr>
             <w:rStyle w:val="Hiperhivatkozs"/>
@@ -1502,7 +1502,7 @@
         </w:r>
         <w:r>
           <w:rPr>
-            <w:rFonts w:asciiTheme="minorHAnsi" w:eastAsiaTheme="minorEastAsia" w:hAnsiTheme="minorHAnsi" w:cstheme="minorBidi"/>
+            <w:rFonts w:asciiTheme="minorHAnsi" w:hAnsiTheme="minorHAnsi" w:eastAsiaTheme="minorEastAsia" w:cstheme="minorBidi"/>
             <w:b w:val="0"/>
             <w:bCs w:val="0"/>
             <w:smallCaps w:val="0"/>
@@ -1577,7 +1577,7 @@
           <w:tab w:val="right" w:pos="9062"/>
         </w:tabs>
         <w:rPr>
-          <w:rFonts w:asciiTheme="minorHAnsi" w:eastAsiaTheme="minorEastAsia" w:hAnsiTheme="minorHAnsi" w:cstheme="minorBidi"/>
+          <w:rFonts w:asciiTheme="minorHAnsi" w:hAnsiTheme="minorHAnsi" w:eastAsiaTheme="minorEastAsia" w:cstheme="minorBidi"/>
           <w:b w:val="0"/>
           <w:bCs w:val="0"/>
           <w:caps w:val="0"/>
@@ -1586,7 +1586,7 @@
           <w:lang w:eastAsia="hu-HU"/>
         </w:rPr>
       </w:pPr>
-      <w:hyperlink w:anchor="_Toc233543068" w:history="1">
+      <w:hyperlink w:history="1" w:anchor="_Toc233543068">
         <w:r>
           <w:rPr>
             <w:rStyle w:val="Hiperhivatkozs"/>
@@ -1597,7 +1597,7 @@
         </w:r>
         <w:r>
           <w:rPr>
-            <w:rFonts w:asciiTheme="minorHAnsi" w:eastAsiaTheme="minorEastAsia" w:hAnsiTheme="minorHAnsi" w:cstheme="minorBidi"/>
+            <w:rFonts w:asciiTheme="minorHAnsi" w:hAnsiTheme="minorHAnsi" w:eastAsiaTheme="minorEastAsia" w:cstheme="minorBidi"/>
             <w:b w:val="0"/>
             <w:bCs w:val="0"/>
             <w:caps w:val="0"/>
@@ -1689,7 +1689,7 @@
           <w:lang w:val="en-US"/>
         </w:rPr>
       </w:pPr>
-      <w:bookmarkStart w:id="0" w:name="_Toc233543052"/>
+      <w:bookmarkStart w:name="_Toc233543052" w:id="0"/>
       <w:r>
         <w:rPr>
           <w:lang w:val="en-US"/>
@@ -1783,7 +1783,7 @@
           <w:lang w:val="en-US"/>
         </w:rPr>
       </w:pPr>
-      <w:bookmarkStart w:id="1" w:name="_Toc233543053"/>
+      <w:bookmarkStart w:name="_Toc233543053" w:id="1"/>
       <w:r>
         <w:rPr>
           <w:lang w:val="en-US"/>
@@ -1816,7 +1816,7 @@
           <w:lang w:val="en-US"/>
         </w:rPr>
       </w:pPr>
-      <w:bookmarkStart w:id="2" w:name="_Toc233543054"/>
+      <w:bookmarkStart w:name="_Toc233543054" w:id="2"/>
       <w:r>
         <w:rPr>
           <w:lang w:val="en-US"/>
@@ -1836,7 +1836,7 @@
           <w:lang w:val="en-US"/>
         </w:rPr>
       </w:pPr>
-      <w:bookmarkStart w:id="3" w:name="_Toc233543055"/>
+      <w:bookmarkStart w:name="_Toc233543055" w:id="3"/>
       <w:r>
         <w:rPr>
           <w:lang w:val="en-US"/>
@@ -2058,7 +2058,7 @@
           <w:lang w:val="en-US"/>
         </w:rPr>
       </w:pPr>
-      <w:bookmarkStart w:id="4" w:name="_Toc233543056"/>
+      <w:bookmarkStart w:name="_Toc233543056" w:id="4"/>
       <w:r>
         <w:rPr>
           <w:lang w:val="en-US"/>
@@ -2152,7 +2152,7 @@
           <w:lang w:val="en-US"/>
         </w:rPr>
       </w:pPr>
-      <w:bookmarkStart w:id="5" w:name="_Toc233543057"/>
+      <w:bookmarkStart w:name="_Toc233543057" w:id="5"/>
       <w:r>
         <w:rPr>
           <w:lang w:val="en-US"/>
@@ -2256,7 +2256,7 @@
         <w:spacing w:before="240"/>
         <w:ind w:left="1077"/>
       </w:pPr>
-      <w:bookmarkStart w:id="6" w:name="_Toc233543058"/>
+      <w:bookmarkStart w:name="_Toc233543058" w:id="6"/>
       <w:r>
         <w:t>Mersenne Twister Design</w:t>
       </w:r>
@@ -2340,7 +2340,7 @@
           <w:lang w:val="en-US"/>
         </w:rPr>
       </w:pPr>
-      <w:bookmarkStart w:id="7" w:name="_Toc233543059"/>
+      <w:bookmarkStart w:name="_Toc233543059" w:id="7"/>
       <w:r>
         <w:rPr>
           <w:lang w:val="en-US"/>
@@ -2364,6 +2364,7 @@
       <w:r>
         <w:rPr>
           <w:rStyle w:val="KdChar"/>
+          <w:lang w:val="en-US"/>
         </w:rPr>
         <w:t>runMonteCarlo()</w:t>
       </w:r>
@@ -2391,7 +2392,7 @@
           <w:lang w:val="en-US"/>
         </w:rPr>
       </w:pPr>
-      <w:bookmarkStart w:id="8" w:name="_Toc233543060"/>
+      <w:bookmarkStart w:name="_Toc233543060" w:id="8"/>
       <w:r>
         <w:rPr>
           <w:lang w:val="en-US"/>
@@ -2403,48 +2404,51 @@
     <w:p>
       <w:pPr>
         <w:rPr>
-          <w:lang w:val="en-US"/>
+          <w:lang w:val="hu-HU"/>
         </w:rPr>
       </w:pPr>
       <w:r>
         <w:rPr>
-          <w:lang w:val="en-US"/>
+          <w:lang w:val="hu-HU"/>
         </w:rPr>
         <w:t xml:space="preserve">All measurements were taken on the previously mentioned hardware. GPU timing uses </w:t>
       </w:r>
       <w:r>
         <w:rPr>
           <w:rStyle w:val="KdChar"/>
+          <w:lang w:val="hu-HU"/>
         </w:rPr>
         <w:t>CL_QUEUE_PROFILING_ENABLE</w:t>
       </w:r>
       <w:r>
         <w:rPr>
-          <w:lang w:val="en-US"/>
+          <w:lang w:val="hu-HU"/>
         </w:rPr>
         <w:t xml:space="preserve"> with </w:t>
       </w:r>
       <w:r>
         <w:rPr>
           <w:rStyle w:val="KdChar"/>
+          <w:lang w:val="hu-HU"/>
         </w:rPr>
         <w:t>cl_ulong</w:t>
       </w:r>
       <w:r>
         <w:rPr>
-          <w:lang w:val="en-US"/>
+          <w:lang w:val="hu-HU"/>
         </w:rPr>
         <w:t xml:space="preserve"> nanosecond timestamps ensuring platform-independent, consistent 64-bit precision. </w:t>
       </w:r>
       <w:r>
         <w:rPr>
           <w:rStyle w:val="KdChar"/>
+          <w:lang w:val="hu-HU"/>
         </w:rPr>
         <w:t>clFinish()</w:t>
       </w:r>
       <w:r>
         <w:rPr>
-          <w:lang w:val="en-US"/>
+          <w:lang w:val="hu-HU"/>
         </w:rPr>
         <w:t xml:space="preserve"> is called after each blocking read to guarantee timestamp commitment before querying the event.</w:t>
       </w:r>
@@ -2462,7 +2466,7 @@
           <w:lang w:val="en-US"/>
         </w:rPr>
       </w:pPr>
-      <w:bookmarkStart w:id="9" w:name="_Toc233543061"/>
+      <w:bookmarkStart w:name="_Toc233543061" w:id="9"/>
       <w:r>
         <w:rPr>
           <w:lang w:val="en-US"/>
@@ -2820,7 +2824,7 @@
           <w:lang w:val="en-US"/>
         </w:rPr>
       </w:pPr>
-      <w:bookmarkStart w:id="10" w:name="_Toc233543062"/>
+      <w:bookmarkStart w:name="_Toc233543062" w:id="10"/>
       <w:r>
         <w:rPr>
           <w:lang w:val="en-US"/>
@@ -3216,7 +3220,7 @@
           <w:lang w:val="en-US"/>
         </w:rPr>
       </w:pPr>
-      <w:bookmarkStart w:id="11" w:name="_Toc233543063"/>
+      <w:bookmarkStart w:name="_Toc233543063" w:id="11"/>
       <w:r>
         <w:rPr>
           <w:lang w:val="en-US"/>
@@ -3244,6 +3248,7 @@
           <w:tcPr>
             <w:cnfStyle w:val="001000000100" w:firstRow="0" w:lastRow="0" w:firstColumn="1" w:lastColumn="0" w:oddVBand="0" w:evenVBand="0" w:oddHBand="0" w:evenHBand="0" w:firstRowFirstColumn="1" w:firstRowLastColumn="0" w:lastRowFirstColumn="0" w:lastRowLastColumn="0"/>
             <w:tcW w:w="3020" w:type="dxa"/>
+            <w:tcMar/>
           </w:tcPr>
           <w:p>
             <w:pPr>
@@ -3271,7 +3276,9 @@
         </w:tc>
         <w:tc>
           <w:tcPr>
+            <w:cnfStyle w:val="000000000000" w:firstRow="0" w:lastRow="0" w:firstColumn="0" w:lastColumn="0" w:oddVBand="0" w:evenVBand="0" w:oddHBand="0" w:evenHBand="0" w:firstRowFirstColumn="0" w:firstRowLastColumn="0" w:lastRowFirstColumn="0" w:lastRowLastColumn="0"/>
             <w:tcW w:w="3021" w:type="dxa"/>
+            <w:tcMar/>
           </w:tcPr>
           <w:p>
             <w:pPr>
@@ -3300,7 +3307,9 @@
         </w:tc>
         <w:tc>
           <w:tcPr>
+            <w:cnfStyle w:val="000000000000" w:firstRow="0" w:lastRow="0" w:firstColumn="0" w:lastColumn="0" w:oddVBand="0" w:evenVBand="0" w:oddHBand="0" w:evenHBand="0" w:firstRowFirstColumn="0" w:firstRowLastColumn="0" w:lastRowFirstColumn="0" w:lastRowLastColumn="0"/>
             <w:tcW w:w="3021" w:type="dxa"/>
+            <w:tcMar/>
           </w:tcPr>
           <w:p>
             <w:pPr>
@@ -3336,6 +3345,7 @@
           <w:tcPr>
             <w:cnfStyle w:val="001000000000" w:firstRow="0" w:lastRow="0" w:firstColumn="1" w:lastColumn="0" w:oddVBand="0" w:evenVBand="0" w:oddHBand="0" w:evenHBand="0" w:firstRowFirstColumn="0" w:firstRowLastColumn="0" w:lastRowFirstColumn="0" w:lastRowLastColumn="0"/>
             <w:tcW w:w="3020" w:type="dxa"/>
+            <w:tcMar/>
           </w:tcPr>
           <w:p>
             <w:pPr>
@@ -3363,7 +3373,9 @@
         </w:tc>
         <w:tc>
           <w:tcPr>
+            <w:cnfStyle w:val="000000000000" w:firstRow="0" w:lastRow="0" w:firstColumn="0" w:lastColumn="0" w:oddVBand="0" w:evenVBand="0" w:oddHBand="0" w:evenHBand="0" w:firstRowFirstColumn="0" w:firstRowLastColumn="0" w:lastRowFirstColumn="0" w:lastRowLastColumn="0"/>
             <w:tcW w:w="3021" w:type="dxa"/>
+            <w:tcMar/>
           </w:tcPr>
           <w:p>
             <w:pPr>
@@ -3391,7 +3403,9 @@
         </w:tc>
         <w:tc>
           <w:tcPr>
+            <w:cnfStyle w:val="000000000000" w:firstRow="0" w:lastRow="0" w:firstColumn="0" w:lastColumn="0" w:oddVBand="0" w:evenVBand="0" w:oddHBand="0" w:evenHBand="0" w:firstRowFirstColumn="0" w:firstRowLastColumn="0" w:lastRowFirstColumn="0" w:lastRowLastColumn="0"/>
             <w:tcW w:w="3021" w:type="dxa"/>
+            <w:tcMar/>
           </w:tcPr>
           <w:p>
             <w:pPr>
@@ -3416,6 +3430,7 @@
           <w:tcPr>
             <w:cnfStyle w:val="001000000000" w:firstRow="0" w:lastRow="0" w:firstColumn="1" w:lastColumn="0" w:oddVBand="0" w:evenVBand="0" w:oddHBand="0" w:evenHBand="0" w:firstRowFirstColumn="0" w:firstRowLastColumn="0" w:lastRowFirstColumn="0" w:lastRowLastColumn="0"/>
             <w:tcW w:w="3020" w:type="dxa"/>
+            <w:tcMar/>
           </w:tcPr>
           <w:p>
             <w:pPr>
@@ -3443,7 +3458,9 @@
         </w:tc>
         <w:tc>
           <w:tcPr>
+            <w:cnfStyle w:val="000000000000" w:firstRow="0" w:lastRow="0" w:firstColumn="0" w:lastColumn="0" w:oddVBand="0" w:evenVBand="0" w:oddHBand="0" w:evenHBand="0" w:firstRowFirstColumn="0" w:firstRowLastColumn="0" w:lastRowFirstColumn="0" w:lastRowLastColumn="0"/>
             <w:tcW w:w="3021" w:type="dxa"/>
+            <w:tcMar/>
           </w:tcPr>
           <w:p>
             <w:pPr>
@@ -3471,7 +3488,9 @@
         </w:tc>
         <w:tc>
           <w:tcPr>
+            <w:cnfStyle w:val="000000000000" w:firstRow="0" w:lastRow="0" w:firstColumn="0" w:lastColumn="0" w:oddVBand="0" w:evenVBand="0" w:oddHBand="0" w:evenHBand="0" w:firstRowFirstColumn="0" w:firstRowLastColumn="0" w:lastRowFirstColumn="0" w:lastRowLastColumn="0"/>
             <w:tcW w:w="3021" w:type="dxa"/>
+            <w:tcMar/>
           </w:tcPr>
           <w:p>
             <w:pPr>
@@ -3499,6 +3518,7 @@
           <w:tcPr>
             <w:cnfStyle w:val="001000000000" w:firstRow="0" w:lastRow="0" w:firstColumn="1" w:lastColumn="0" w:oddVBand="0" w:evenVBand="0" w:oddHBand="0" w:evenHBand="0" w:firstRowFirstColumn="0" w:firstRowLastColumn="0" w:lastRowFirstColumn="0" w:lastRowLastColumn="0"/>
             <w:tcW w:w="3020" w:type="dxa"/>
+            <w:tcMar/>
           </w:tcPr>
           <w:p>
             <w:pPr>
@@ -3526,7 +3546,9 @@
         </w:tc>
         <w:tc>
           <w:tcPr>
+            <w:cnfStyle w:val="000000000000" w:firstRow="0" w:lastRow="0" w:firstColumn="0" w:lastColumn="0" w:oddVBand="0" w:evenVBand="0" w:oddHBand="0" w:evenHBand="0" w:firstRowFirstColumn="0" w:firstRowLastColumn="0" w:lastRowFirstColumn="0" w:lastRowLastColumn="0"/>
             <w:tcW w:w="3021" w:type="dxa"/>
+            <w:tcMar/>
           </w:tcPr>
           <w:p>
             <w:pPr>
@@ -3554,7 +3576,9 @@
         </w:tc>
         <w:tc>
           <w:tcPr>
+            <w:cnfStyle w:val="000000000000" w:firstRow="0" w:lastRow="0" w:firstColumn="0" w:lastColumn="0" w:oddVBand="0" w:evenVBand="0" w:oddHBand="0" w:evenHBand="0" w:firstRowFirstColumn="0" w:firstRowLastColumn="0" w:lastRowFirstColumn="0" w:lastRowLastColumn="0"/>
             <w:tcW w:w="3021" w:type="dxa"/>
+            <w:tcMar/>
           </w:tcPr>
           <w:p>
             <w:pPr>
@@ -3579,6 +3603,7 @@
           <w:tcPr>
             <w:cnfStyle w:val="001000000000" w:firstRow="0" w:lastRow="0" w:firstColumn="1" w:lastColumn="0" w:oddVBand="0" w:evenVBand="0" w:oddHBand="0" w:evenHBand="0" w:firstRowFirstColumn="0" w:firstRowLastColumn="0" w:lastRowFirstColumn="0" w:lastRowLastColumn="0"/>
             <w:tcW w:w="3020" w:type="dxa"/>
+            <w:tcMar/>
           </w:tcPr>
           <w:p>
             <w:pPr>
@@ -3630,30 +3655,46 @@
         </w:tc>
         <w:tc>
           <w:tcPr>
+            <w:cnfStyle w:val="000000000000" w:firstRow="0" w:lastRow="0" w:firstColumn="0" w:lastColumn="0" w:oddVBand="0" w:evenVBand="0" w:oddHBand="0" w:evenHBand="0" w:firstRowFirstColumn="0" w:firstRowLastColumn="0" w:lastRowFirstColumn="0" w:lastRowLastColumn="0"/>
             <w:tcW w:w="3021" w:type="dxa"/>
+            <w:tcMar/>
           </w:tcPr>
           <w:p>
             <w:pPr>
               <w:cnfStyle w:val="000000000000" w:firstRow="0" w:lastRow="0" w:firstColumn="0" w:lastColumn="0" w:oddVBand="0" w:evenVBand="0" w:oddHBand="0" w:evenHBand="0" w:firstRowFirstColumn="0" w:firstRowLastColumn="0" w:lastRowFirstColumn="0" w:lastRowLastColumn="0"/>
-              <w:rPr>
-                <w:color w:val="1F4E79" w:themeColor="accent1" w:themeShade="80"/>
-                <w:lang w:val="en-US"/>
-              </w:rPr>
-            </w:pPr>
-          </w:p>
-        </w:tc>
-        <w:tc>
-          <w:tcPr>
+            </w:pPr>
+            <w:r>
+              <w:rPr>
+                <w:rFonts w:ascii="Spectral" w:hAnsi="Spectral" w:eastAsia="Spectral" w:cs="Spectral"/>
+                <w:noProof w:val="0"/>
+                <w:sz w:val="22"/>
+                <w:szCs w:val="22"/>
+                <w:lang w:val="en-US"/>
+              </w:rPr>
+              <w:t>3.4562</w:t>
+            </w:r>
+          </w:p>
+        </w:tc>
+        <w:tc>
+          <w:tcPr>
+            <w:cnfStyle w:val="000000000000" w:firstRow="0" w:lastRow="0" w:firstColumn="0" w:lastColumn="0" w:oddVBand="0" w:evenVBand="0" w:oddHBand="0" w:evenHBand="0" w:firstRowFirstColumn="0" w:firstRowLastColumn="0" w:lastRowFirstColumn="0" w:lastRowLastColumn="0"/>
             <w:tcW w:w="3021" w:type="dxa"/>
+            <w:tcMar/>
           </w:tcPr>
           <w:p>
             <w:pPr>
               <w:cnfStyle w:val="000000000000" w:firstRow="0" w:lastRow="0" w:firstColumn="0" w:lastColumn="0" w:oddVBand="0" w:evenVBand="0" w:oddHBand="0" w:evenHBand="0" w:firstRowFirstColumn="0" w:firstRowLastColumn="0" w:lastRowFirstColumn="0" w:lastRowLastColumn="0"/>
-              <w:rPr>
-                <w:color w:val="1F4E79" w:themeColor="accent1" w:themeShade="80"/>
-                <w:lang w:val="en-US"/>
-              </w:rPr>
-            </w:pPr>
+            </w:pPr>
+            <w:r>
+              <w:rPr>
+                <w:rFonts w:ascii="Spectral" w:hAnsi="Spectral" w:eastAsia="Spectral" w:cs="Spectral"/>
+                <w:noProof w:val="0"/>
+                <w:sz w:val="22"/>
+                <w:szCs w:val="22"/>
+                <w:lang w:val="en-US"/>
+              </w:rPr>
+              <w:t>75.8475</w:t>
+            </w:r>
           </w:p>
         </w:tc>
       </w:tr>
@@ -3669,7 +3710,7 @@
           <w:lang w:val="en-US"/>
         </w:rPr>
       </w:pPr>
-      <w:bookmarkStart w:id="12" w:name="_Toc233543064"/>
+      <w:bookmarkStart w:name="_Toc233543064" w:id="12"/>
       <w:r>
         <w:rPr>
           <w:lang w:val="en-US"/>
@@ -3681,78 +3722,81 @@
     <w:p>
       <w:pPr>
         <w:rPr>
-          <w:lang w:val="en-US"/>
+          <w:lang w:val="hu-HU"/>
         </w:rPr>
       </w:pPr>
       <w:r>
         <w:rPr>
-          <w:lang w:val="en-US"/>
+          <w:lang w:val="hu-HU"/>
         </w:rPr>
         <w:t xml:space="preserve">The </w:t>
       </w:r>
       <w:r>
         <w:rPr>
-          <w:lang w:val="en-US"/>
+          <w:lang w:val="hu-HU"/>
         </w:rPr>
         <w:t>C</w:t>
       </w:r>
       <w:r>
         <w:rPr>
-          <w:lang w:val="en-US"/>
+          <w:lang w:val="hu-HU"/>
         </w:rPr>
         <w:t>hi-</w:t>
       </w:r>
       <w:r>
         <w:rPr>
-          <w:lang w:val="en-US"/>
+          <w:lang w:val="hu-HU"/>
         </w:rPr>
         <w:t>S</w:t>
       </w:r>
       <w:r>
         <w:rPr>
-          <w:lang w:val="en-US"/>
+          <w:lang w:val="hu-HU"/>
         </w:rPr>
         <w:t>quare goodness-of-fit test measures whether the generated distribution deviates significantly from uniform. Bins are determined by Sturges' rule</w:t>
       </w:r>
       <w:r>
         <w:rPr>
-          <w:lang w:val="en-US"/>
+          <w:lang w:val="hu-HU"/>
         </w:rPr>
         <w:t xml:space="preserve">: </w:t>
       </w:r>
       <w:r>
         <w:rPr>
           <w:rStyle w:val="KdChar"/>
+          <w:lang w:val="hu-HU"/>
         </w:rPr>
         <w:t>K = 1 + floor(log2(N))</w:t>
       </w:r>
       <w:r>
         <w:rPr>
-          <w:lang w:val="en-US"/>
+          <w:lang w:val="hu-HU"/>
         </w:rPr>
         <w:t xml:space="preserve">. Bins with fewer than 600 observations are dropped before computing the statistic. The critical value at the 5% significance level for </w:t>
       </w:r>
       <w:r>
         <w:rPr>
           <w:rStyle w:val="KdChar"/>
+          <w:lang w:val="hu-HU"/>
         </w:rPr>
         <w:t>df = 18</w:t>
       </w:r>
       <w:r>
         <w:rPr>
-          <w:lang w:val="en-US"/>
+          <w:lang w:val="hu-HU"/>
         </w:rPr>
         <w:t xml:space="preserve"> is </w:t>
       </w:r>
       <w:r>
         <w:rPr>
           <w:rStyle w:val="KdChar"/>
+          <w:lang w:val="hu-HU"/>
         </w:rPr>
         <w:t>28.87</w:t>
       </w:r>
       <w:r>
         <w:rPr>
-          <w:lang w:val="en-US"/>
+          <w:lang w:val="hu-HU"/>
         </w:rPr>
         <w:t>.</w:t>
       </w:r>
@@ -4497,7 +4541,7 @@
           <w:lang w:val="en-US"/>
         </w:rPr>
       </w:pPr>
-      <w:bookmarkStart w:id="13" w:name="_Toc233543065"/>
+      <w:bookmarkStart w:name="_Toc233543065" w:id="13"/>
       <w:r>
         <w:rPr>
           <w:lang w:val="en-US"/>
@@ -4518,7 +4562,7 @@
           <w:lang w:val="en-US"/>
         </w:rPr>
       </w:pPr>
-      <w:bookmarkStart w:id="14" w:name="_Toc233543066"/>
+      <w:bookmarkStart w:name="_Toc233543066" w:id="14"/>
       <w:r>
         <w:rPr>
           <w:lang w:val="en-US"/>
@@ -5314,7 +5358,7 @@
           <w:lang w:val="en-US"/>
         </w:rPr>
       </w:pPr>
-      <w:bookmarkStart w:id="15" w:name="_Toc233543067"/>
+      <w:bookmarkStart w:name="_Toc233543067" w:id="15"/>
       <w:r>
         <w:rPr>
           <w:lang w:val="en-US"/>
@@ -6553,7 +6597,7 @@
           <w:lang w:val="en-US"/>
         </w:rPr>
       </w:pPr>
-      <w:bookmarkStart w:id="16" w:name="_Toc233543068"/>
+      <w:bookmarkStart w:name="_Toc233543068" w:id="16"/>
       <w:r>
         <w:rPr>
           <w:lang w:val="en-US"/>
@@ -6581,6 +6625,7 @@
           <w:tcPr>
             <w:cnfStyle w:val="001000000000" w:firstRow="0" w:lastRow="0" w:firstColumn="1" w:lastColumn="0" w:oddVBand="0" w:evenVBand="0" w:oddHBand="0" w:evenHBand="0" w:firstRowFirstColumn="0" w:firstRowLastColumn="0" w:lastRowFirstColumn="0" w:lastRowLastColumn="0"/>
             <w:tcW w:w="4531" w:type="dxa"/>
+            <w:tcMar/>
           </w:tcPr>
           <w:p>
             <w:pPr>
@@ -6598,7 +6643,9 @@
         </w:tc>
         <w:tc>
           <w:tcPr>
+            <w:cnfStyle w:val="000000000000" w:firstRow="0" w:lastRow="0" w:firstColumn="0" w:lastColumn="0" w:oddVBand="0" w:evenVBand="0" w:oddHBand="0" w:evenHBand="0" w:firstRowFirstColumn="0" w:firstRowLastColumn="0" w:lastRowFirstColumn="0" w:lastRowLastColumn="0"/>
             <w:tcW w:w="4531" w:type="dxa"/>
+            <w:tcMar/>
           </w:tcPr>
           <w:p>
             <w:pPr>
@@ -6624,6 +6671,7 @@
           <w:tcPr>
             <w:cnfStyle w:val="001000000000" w:firstRow="0" w:lastRow="0" w:firstColumn="1" w:lastColumn="0" w:oddVBand="0" w:evenVBand="0" w:oddHBand="0" w:evenHBand="0" w:firstRowFirstColumn="0" w:firstRowLastColumn="0" w:lastRowFirstColumn="0" w:lastRowLastColumn="0"/>
             <w:tcW w:w="4531" w:type="dxa"/>
+            <w:tcMar/>
           </w:tcPr>
           <w:p>
             <w:pPr>
@@ -6641,7 +6689,9 @@
         </w:tc>
         <w:tc>
           <w:tcPr>
+            <w:cnfStyle w:val="000000000000" w:firstRow="0" w:lastRow="0" w:firstColumn="0" w:lastColumn="0" w:oddVBand="0" w:evenVBand="0" w:oddHBand="0" w:evenHBand="0" w:firstRowFirstColumn="0" w:firstRowLastColumn="0" w:lastRowFirstColumn="0" w:lastRowLastColumn="0"/>
             <w:tcW w:w="4531" w:type="dxa"/>
+            <w:tcMar/>
           </w:tcPr>
           <w:p>
             <w:pPr>
@@ -6649,102 +6699,112 @@
               <w:cnfStyle w:val="000000100000" w:firstRow="0" w:lastRow="0" w:firstColumn="0" w:lastColumn="0" w:oddVBand="0" w:evenVBand="0" w:oddHBand="1" w:evenHBand="0" w:firstRowFirstColumn="0" w:firstRowLastColumn="0" w:lastRowFirstColumn="0" w:lastRowLastColumn="0"/>
               <w:rPr>
                 <w:rFonts w:ascii="Arial" w:hAnsi="Arial"/>
-                <w:lang w:val="en-US"/>
+                <w:lang w:val="hu-HU"/>
               </w:rPr>
             </w:pPr>
             <w:r>
               <w:rPr>
                 <w:rStyle w:val="KdChar"/>
+                <w:lang w:val="hu-HU"/>
               </w:rPr>
               <w:t>checkError</w:t>
             </w:r>
             <w:r>
               <w:rPr>
                 <w:rStyle w:val="KdChar"/>
+                <w:lang w:val="hu-HU"/>
               </w:rPr>
               <w:t>()</w:t>
             </w:r>
             <w:r>
               <w:rPr>
-                <w:color w:val="000000"/>
+                <w:color w:val="000000" w:themeColor="text1" w:themeTint="FF" w:themeShade="FF"/>
                 <w:sz w:val="20"/>
                 <w:szCs w:val="20"/>
-                <w:lang w:val="en-US"/>
+                <w:lang w:val="hu-HU"/>
               </w:rPr>
               <w:t xml:space="preserve">, </w:t>
             </w:r>
             <w:r>
               <w:rPr>
                 <w:rStyle w:val="KdChar"/>
+                <w:lang w:val="hu-HU"/>
               </w:rPr>
               <w:t>buildProgramWithLog</w:t>
             </w:r>
             <w:r>
               <w:rPr>
                 <w:rStyle w:val="KdChar"/>
+                <w:lang w:val="hu-HU"/>
               </w:rPr>
               <w:t>()</w:t>
             </w:r>
             <w:r>
               <w:rPr>
-                <w:color w:val="000000"/>
+                <w:color w:val="000000" w:themeColor="text1" w:themeTint="FF" w:themeShade="FF"/>
                 <w:sz w:val="20"/>
                 <w:szCs w:val="20"/>
-                <w:lang w:val="en-US"/>
+                <w:lang w:val="hu-HU"/>
               </w:rPr>
               <w:t xml:space="preserve">, </w:t>
             </w:r>
             <w:r>
               <w:rPr>
                 <w:rStyle w:val="KdChar"/>
+                <w:lang w:val="hu-HU"/>
               </w:rPr>
               <w:t>CLKernel</w:t>
             </w:r>
             <w:r>
               <w:rPr>
                 <w:rStyle w:val="KdChar"/>
+                <w:lang w:val="hu-HU"/>
               </w:rPr>
               <w:t>()</w:t>
             </w:r>
             <w:r>
               <w:rPr>
-                <w:color w:val="000000"/>
+                <w:color w:val="000000" w:themeColor="text1" w:themeTint="FF" w:themeShade="FF"/>
                 <w:sz w:val="20"/>
                 <w:szCs w:val="20"/>
-                <w:lang w:val="en-US"/>
+                <w:lang w:val="hu-HU"/>
               </w:rPr>
               <w:t xml:space="preserve">, </w:t>
             </w:r>
             <w:r>
               <w:rPr>
                 <w:rStyle w:val="KdChar"/>
+                <w:lang w:val="hu-HU"/>
               </w:rPr>
               <w:t>buildKernel</w:t>
             </w:r>
             <w:r>
               <w:rPr>
                 <w:rStyle w:val="KdChar"/>
+                <w:lang w:val="hu-HU"/>
               </w:rPr>
               <w:t>()</w:t>
             </w:r>
             <w:r>
               <w:rPr>
-                <w:color w:val="000000"/>
+                <w:color w:val="000000" w:themeColor="text1" w:themeTint="FF" w:themeShade="FF"/>
                 <w:sz w:val="20"/>
                 <w:szCs w:val="20"/>
-                <w:lang w:val="en-US"/>
+                <w:lang w:val="hu-HU"/>
               </w:rPr>
               <w:t xml:space="preserve">, </w:t>
             </w:r>
             <w:r>
               <w:rPr>
                 <w:rStyle w:val="KdChar"/>
+                <w:lang w:val="hu-HU"/>
               </w:rPr>
               <w:t>profilingMs</w:t>
             </w:r>
             <w:r>
               <w:rPr>
                 <w:rStyle w:val="KdChar"/>
+                <w:lang w:val="hu-HU"/>
               </w:rPr>
               <w:t>()</w:t>
             </w:r>
@@ -6756,6 +6816,7 @@
           <w:tcPr>
             <w:cnfStyle w:val="001000000000" w:firstRow="0" w:lastRow="0" w:firstColumn="1" w:lastColumn="0" w:oddVBand="0" w:evenVBand="0" w:oddHBand="0" w:evenHBand="0" w:firstRowFirstColumn="0" w:firstRowLastColumn="0" w:lastRowFirstColumn="0" w:lastRowLastColumn="0"/>
             <w:tcW w:w="4531" w:type="dxa"/>
+            <w:tcMar/>
           </w:tcPr>
           <w:p>
             <w:pPr>
@@ -6773,7 +6834,9 @@
         </w:tc>
         <w:tc>
           <w:tcPr>
+            <w:cnfStyle w:val="000000000000" w:firstRow="0" w:lastRow="0" w:firstColumn="0" w:lastColumn="0" w:oddVBand="0" w:evenVBand="0" w:oddHBand="0" w:evenHBand="0" w:firstRowFirstColumn="0" w:firstRowLastColumn="0" w:lastRowFirstColumn="0" w:lastRowLastColumn="0"/>
             <w:tcW w:w="4531" w:type="dxa"/>
+            <w:tcMar/>
           </w:tcPr>
           <w:p>
             <w:pPr>
@@ -6802,6 +6865,7 @@
           <w:tcPr>
             <w:cnfStyle w:val="001000000000" w:firstRow="0" w:lastRow="0" w:firstColumn="1" w:lastColumn="0" w:oddVBand="0" w:evenVBand="0" w:oddHBand="0" w:evenHBand="0" w:firstRowFirstColumn="0" w:firstRowLastColumn="0" w:lastRowFirstColumn="0" w:lastRowLastColumn="0"/>
             <w:tcW w:w="4531" w:type="dxa"/>
+            <w:tcMar/>
           </w:tcPr>
           <w:p>
             <w:pPr>
@@ -6819,7 +6883,9 @@
         </w:tc>
         <w:tc>
           <w:tcPr>
+            <w:cnfStyle w:val="000000000000" w:firstRow="0" w:lastRow="0" w:firstColumn="0" w:lastColumn="0" w:oddVBand="0" w:evenVBand="0" w:oddHBand="0" w:evenHBand="0" w:firstRowFirstColumn="0" w:firstRowLastColumn="0" w:lastRowFirstColumn="0" w:lastRowLastColumn="0"/>
             <w:tcW w:w="4531" w:type="dxa"/>
+            <w:tcMar/>
           </w:tcPr>
           <w:p>
             <w:pPr>
@@ -6845,6 +6911,7 @@
           <w:tcPr>
             <w:cnfStyle w:val="001000000000" w:firstRow="0" w:lastRow="0" w:firstColumn="1" w:lastColumn="0" w:oddVBand="0" w:evenVBand="0" w:oddHBand="0" w:evenHBand="0" w:firstRowFirstColumn="0" w:firstRowLastColumn="0" w:lastRowFirstColumn="0" w:lastRowLastColumn="0"/>
             <w:tcW w:w="4531" w:type="dxa"/>
+            <w:tcMar/>
           </w:tcPr>
           <w:p>
             <w:pPr>
@@ -6862,18 +6929,21 @@
         </w:tc>
         <w:tc>
           <w:tcPr>
+            <w:cnfStyle w:val="000000000000" w:firstRow="0" w:lastRow="0" w:firstColumn="0" w:lastColumn="0" w:oddVBand="0" w:evenVBand="0" w:oddHBand="0" w:evenHBand="0" w:firstRowFirstColumn="0" w:firstRowLastColumn="0" w:lastRowFirstColumn="0" w:lastRowLastColumn="0"/>
             <w:tcW w:w="4531" w:type="dxa"/>
+            <w:tcMar/>
           </w:tcPr>
           <w:p>
             <w:pPr>
               <w:cnfStyle w:val="000000000000" w:firstRow="0" w:lastRow="0" w:firstColumn="0" w:lastColumn="0" w:oddVBand="0" w:evenVBand="0" w:oddHBand="0" w:evenHBand="0" w:firstRowFirstColumn="0" w:firstRowLastColumn="0" w:lastRowFirstColumn="0" w:lastRowLastColumn="0"/>
               <w:rPr>
-                <w:lang w:val="en-US"/>
+                <w:lang w:val="hu-HU"/>
               </w:rPr>
             </w:pPr>
             <w:r>
               <w:rPr>
                 <w:rStyle w:val="KdChar"/>
+                <w:lang w:val="hu-HU"/>
               </w:rPr>
               <w:t>runMonteCarlo()</w:t>
             </w:r>
@@ -6881,15 +6951,16 @@
               <w:rPr>
                 <w:rStyle w:val="KdChar"/>
                 <w:rFonts w:ascii="Spectral" w:hAnsi="Spectral"/>
+                <w:lang w:val="hu-HU"/>
               </w:rPr>
               <w:t xml:space="preserve">: </w:t>
             </w:r>
             <w:r>
               <w:rPr>
-                <w:color w:val="000000"/>
+                <w:color w:val="000000" w:themeColor="text1" w:themeTint="FF" w:themeShade="FF"/>
                 <w:sz w:val="20"/>
                 <w:szCs w:val="20"/>
-                <w:lang w:val="en-US"/>
+                <w:lang w:val="hu-HU"/>
               </w:rPr>
               <w:t>generic mechanical execution + readback</w:t>
             </w:r>
@@ -6904,6 +6975,7 @@
           <w:tcPr>
             <w:cnfStyle w:val="001000000000" w:firstRow="0" w:lastRow="0" w:firstColumn="1" w:lastColumn="0" w:oddVBand="0" w:evenVBand="0" w:oddHBand="0" w:evenHBand="0" w:firstRowFirstColumn="0" w:firstRowLastColumn="0" w:lastRowFirstColumn="0" w:lastRowLastColumn="0"/>
             <w:tcW w:w="4531" w:type="dxa"/>
+            <w:tcMar/>
           </w:tcPr>
           <w:p>
             <w:pPr>
@@ -6921,18 +6993,21 @@
         </w:tc>
         <w:tc>
           <w:tcPr>
+            <w:cnfStyle w:val="000000000000" w:firstRow="0" w:lastRow="0" w:firstColumn="0" w:lastColumn="0" w:oddVBand="0" w:evenVBand="0" w:oddHBand="0" w:evenHBand="0" w:firstRowFirstColumn="0" w:firstRowLastColumn="0" w:lastRowFirstColumn="0" w:lastRowLastColumn="0"/>
             <w:tcW w:w="4531" w:type="dxa"/>
+            <w:tcMar/>
           </w:tcPr>
           <w:p>
             <w:pPr>
               <w:cnfStyle w:val="000000100000" w:firstRow="0" w:lastRow="0" w:firstColumn="0" w:lastColumn="0" w:oddVBand="0" w:evenVBand="0" w:oddHBand="1" w:evenHBand="0" w:firstRowFirstColumn="0" w:firstRowLastColumn="0" w:lastRowFirstColumn="0" w:lastRowLastColumn="0"/>
               <w:rPr>
-                <w:lang w:val="en-US"/>
+                <w:lang w:val="hu-HU"/>
               </w:rPr>
             </w:pPr>
             <w:r>
               <w:rPr>
                 <w:rStyle w:val="KdChar"/>
+                <w:lang w:val="hu-HU"/>
               </w:rPr>
               <w:t>runChiSquareTest()</w:t>
             </w:r>
@@ -6940,15 +7015,16 @@
               <w:rPr>
                 <w:rStyle w:val="KdChar"/>
                 <w:rFonts w:ascii="Spectral" w:hAnsi="Spectral"/>
+                <w:lang w:val="hu-HU"/>
               </w:rPr>
               <w:t xml:space="preserve">: </w:t>
             </w:r>
             <w:r>
               <w:rPr>
-                <w:color w:val="000000"/>
+                <w:color w:val="000000" w:themeColor="text1" w:themeTint="FF" w:themeShade="FF"/>
                 <w:sz w:val="20"/>
                 <w:szCs w:val="20"/>
-                <w:lang w:val="en-US"/>
+                <w:lang w:val="hu-HU"/>
               </w:rPr>
               <w:t>Sturges binning + chi-square statistic</w:t>
             </w:r>
@@ -6960,6 +7036,7 @@
           <w:tcPr>
             <w:cnfStyle w:val="001000000000" w:firstRow="0" w:lastRow="0" w:firstColumn="1" w:lastColumn="0" w:oddVBand="0" w:evenVBand="0" w:oddHBand="0" w:evenHBand="0" w:firstRowFirstColumn="0" w:firstRowLastColumn="0" w:lastRowFirstColumn="0" w:lastRowLastColumn="0"/>
             <w:tcW w:w="4531" w:type="dxa"/>
+            <w:tcMar/>
           </w:tcPr>
           <w:p>
             <w:pPr>
@@ -6977,33 +7054,37 @@
         </w:tc>
         <w:tc>
           <w:tcPr>
+            <w:cnfStyle w:val="000000000000" w:firstRow="0" w:lastRow="0" w:firstColumn="0" w:lastColumn="0" w:oddVBand="0" w:evenVBand="0" w:oddHBand="0" w:evenHBand="0" w:firstRowFirstColumn="0" w:firstRowLastColumn="0" w:lastRowFirstColumn="0" w:lastRowLastColumn="0"/>
             <w:tcW w:w="4531" w:type="dxa"/>
+            <w:tcMar/>
           </w:tcPr>
           <w:p>
             <w:pPr>
               <w:cnfStyle w:val="000000000000" w:firstRow="0" w:lastRow="0" w:firstColumn="0" w:lastColumn="0" w:oddVBand="0" w:evenVBand="0" w:oddHBand="0" w:evenHBand="0" w:firstRowFirstColumn="0" w:firstRowLastColumn="0" w:lastRowFirstColumn="0" w:lastRowLastColumn="0"/>
               <w:rPr>
-                <w:lang w:val="en-US"/>
+                <w:lang w:val="hu-HU"/>
               </w:rPr>
             </w:pPr>
             <w:r>
               <w:rPr>
                 <w:rStyle w:val="KdChar"/>
+                <w:lang w:val="hu-HU"/>
               </w:rPr>
               <w:t>exportHistogramCSV()</w:t>
             </w:r>
             <w:r>
               <w:rPr>
                 <w:rStyle w:val="KdChar"/>
+                <w:lang w:val="hu-HU"/>
               </w:rPr>
               <w:t xml:space="preserve">: </w:t>
             </w:r>
             <w:r>
               <w:rPr>
-                <w:color w:val="000000"/>
+                <w:color w:val="000000" w:themeColor="text1" w:themeTint="FF" w:themeShade="FF"/>
                 <w:sz w:val="20"/>
                 <w:szCs w:val="20"/>
-                <w:lang w:val="en-US"/>
+                <w:lang w:val="hu-HU"/>
               </w:rPr>
               <w:t>writes bin/count CSV for plotting</w:t>
             </w:r>
@@ -7018,6 +7099,7 @@
           <w:tcPr>
             <w:cnfStyle w:val="001000000000" w:firstRow="0" w:lastRow="0" w:firstColumn="1" w:lastColumn="0" w:oddVBand="0" w:evenVBand="0" w:oddHBand="0" w:evenHBand="0" w:firstRowFirstColumn="0" w:firstRowLastColumn="0" w:lastRowFirstColumn="0" w:lastRowLastColumn="0"/>
             <w:tcW w:w="4531" w:type="dxa"/>
+            <w:tcMar/>
           </w:tcPr>
           <w:p>
             <w:pPr>
@@ -7035,47 +7117,51 @@
         </w:tc>
         <w:tc>
           <w:tcPr>
+            <w:cnfStyle w:val="000000000000" w:firstRow="0" w:lastRow="0" w:firstColumn="0" w:lastColumn="0" w:oddVBand="0" w:evenVBand="0" w:oddHBand="0" w:evenHBand="0" w:firstRowFirstColumn="0" w:firstRowLastColumn="0" w:lastRowFirstColumn="0" w:lastRowLastColumn="0"/>
             <w:tcW w:w="4531" w:type="dxa"/>
+            <w:tcMar/>
           </w:tcPr>
           <w:p>
             <w:pPr>
               <w:cnfStyle w:val="000000100000" w:firstRow="0" w:lastRow="0" w:firstColumn="0" w:lastColumn="0" w:oddVBand="0" w:evenVBand="0" w:oddHBand="1" w:evenHBand="0" w:firstRowFirstColumn="0" w:firstRowLastColumn="0" w:lastRowFirstColumn="0" w:lastRowLastColumn="0"/>
               <w:rPr>
-                <w:lang w:val="en-US"/>
+                <w:lang w:val="hu-HU"/>
               </w:rPr>
             </w:pPr>
             <w:r>
               <w:rPr>
                 <w:rStyle w:val="KdChar"/>
+                <w:lang w:val="hu-HU"/>
               </w:rPr>
               <w:t>runCPUBaseline()</w:t>
             </w:r>
             <w:r>
               <w:rPr>
                 <w:rStyle w:val="KdChar"/>
+                <w:lang w:val="hu-HU"/>
               </w:rPr>
               <w:t xml:space="preserve">: </w:t>
             </w:r>
-            <w:proofErr w:type="gramStart"/>
             <w:r>
               <w:rPr>
                 <w:rStyle w:val="KdChar"/>
+                <w:lang w:val="hu-HU"/>
               </w:rPr>
               <w:t>std::</w:t>
             </w:r>
-            <w:proofErr w:type="gramEnd"/>
             <w:r>
               <w:rPr>
                 <w:rStyle w:val="KdChar"/>
+                <w:lang w:val="hu-HU"/>
               </w:rPr>
               <w:t>mt19937</w:t>
             </w:r>
             <w:r>
               <w:rPr>
-                <w:color w:val="000000"/>
+                <w:color w:val="000000" w:themeColor="text1" w:themeTint="FF" w:themeShade="FF"/>
                 <w:sz w:val="20"/>
                 <w:szCs w:val="20"/>
-                <w:lang w:val="en-US"/>
+                <w:lang w:val="hu-HU"/>
               </w:rPr>
               <w:t xml:space="preserve"> timing + chi-square</w:t>
             </w:r>
@@ -7087,6 +7173,7 @@
           <w:tcPr>
             <w:cnfStyle w:val="001000000000" w:firstRow="0" w:lastRow="0" w:firstColumn="1" w:lastColumn="0" w:oddVBand="0" w:evenVBand="0" w:oddHBand="0" w:evenHBand="0" w:firstRowFirstColumn="0" w:firstRowLastColumn="0" w:lastRowFirstColumn="0" w:lastRowLastColumn="0"/>
             <w:tcW w:w="4531" w:type="dxa"/>
+            <w:tcMar/>
           </w:tcPr>
           <w:p>
             <w:pPr>
@@ -7104,7 +7191,9 @@
         </w:tc>
         <w:tc>
           <w:tcPr>
+            <w:cnfStyle w:val="000000000000" w:firstRow="0" w:lastRow="0" w:firstColumn="0" w:lastColumn="0" w:oddVBand="0" w:evenVBand="0" w:oddHBand="0" w:evenHBand="0" w:firstRowFirstColumn="0" w:firstRowLastColumn="0" w:lastRowFirstColumn="0" w:lastRowLastColumn="0"/>
             <w:tcW w:w="4531" w:type="dxa"/>
+            <w:tcMar/>
           </w:tcPr>
           <w:p>
             <w:pPr>
@@ -7133,6 +7222,7 @@
           <w:tcPr>
             <w:cnfStyle w:val="001000000000" w:firstRow="0" w:lastRow="0" w:firstColumn="1" w:lastColumn="0" w:oddVBand="0" w:evenVBand="0" w:oddHBand="0" w:evenHBand="0" w:firstRowFirstColumn="0" w:firstRowLastColumn="0" w:lastRowFirstColumn="0" w:lastRowLastColumn="0"/>
             <w:tcW w:w="4531" w:type="dxa"/>
+            <w:tcMar/>
           </w:tcPr>
           <w:p>
             <w:pPr>
@@ -7150,7 +7240,9 @@
         </w:tc>
         <w:tc>
           <w:tcPr>
+            <w:cnfStyle w:val="000000000000" w:firstRow="0" w:lastRow="0" w:firstColumn="0" w:lastColumn="0" w:oddVBand="0" w:evenVBand="0" w:oddHBand="0" w:evenHBand="0" w:firstRowFirstColumn="0" w:firstRowLastColumn="0" w:lastRowFirstColumn="0" w:lastRowLastColumn="0"/>
             <w:tcW w:w="4531" w:type="dxa"/>
+            <w:tcMar/>
           </w:tcPr>
           <w:p>
             <w:pPr>
@@ -7177,7 +7269,7 @@
       </w:pPr>
     </w:p>
     <w:sectPr>
-      <w:pgSz w:w="11906" w:h="16838"/>
+      <w:pgSz w:w="11906" w:h="16838" w:orient="portrait"/>
       <w:pgMar w:top="1417" w:right="1417" w:bottom="1417" w:left="1417" w:header="708" w:footer="708" w:gutter="0"/>
       <w:cols w:space="708"/>
       <w:docGrid w:linePitch="360"/>
@@ -7409,7 +7501,7 @@
   <w:docDefaults>
     <w:rPrDefault>
       <w:rPr>
-        <w:rFonts w:asciiTheme="minorHAnsi" w:eastAsiaTheme="minorHAnsi" w:hAnsiTheme="minorHAnsi" w:cstheme="minorBidi"/>
+        <w:rFonts w:asciiTheme="minorHAnsi" w:hAnsiTheme="minorHAnsi" w:eastAsiaTheme="minorHAnsi" w:cstheme="minorBidi"/>
         <w:sz w:val="22"/>
         <w:szCs w:val="22"/>
         <w:lang w:val="hu-HU" w:eastAsia="en-US" w:bidi="ar-SA"/>
@@ -7424,14 +7516,14 @@
   <w:latentStyles w:defLockedState="0" w:defUIPriority="99" w:defSemiHidden="0" w:defUnhideWhenUsed="0" w:defQFormat="0" w:count="376">
     <w:lsdException w:name="Normal" w:uiPriority="0" w:qFormat="1"/>
     <w:lsdException w:name="heading 1" w:uiPriority="9" w:qFormat="1"/>
-    <w:lsdException w:name="heading 2" w:semiHidden="1" w:uiPriority="9" w:unhideWhenUsed="1" w:qFormat="1"/>
-    <w:lsdException w:name="heading 3" w:semiHidden="1" w:uiPriority="9" w:unhideWhenUsed="1" w:qFormat="1"/>
-    <w:lsdException w:name="heading 4" w:semiHidden="1" w:uiPriority="9" w:unhideWhenUsed="1" w:qFormat="1"/>
-    <w:lsdException w:name="heading 5" w:semiHidden="1" w:uiPriority="9" w:unhideWhenUsed="1" w:qFormat="1"/>
-    <w:lsdException w:name="heading 6" w:semiHidden="1" w:uiPriority="9" w:unhideWhenUsed="1" w:qFormat="1"/>
-    <w:lsdException w:name="heading 7" w:semiHidden="1" w:uiPriority="9" w:unhideWhenUsed="1" w:qFormat="1"/>
-    <w:lsdException w:name="heading 8" w:semiHidden="1" w:uiPriority="9" w:unhideWhenUsed="1" w:qFormat="1"/>
-    <w:lsdException w:name="heading 9" w:semiHidden="1" w:uiPriority="9" w:unhideWhenUsed="1" w:qFormat="1"/>
+    <w:lsdException w:name="heading 2" w:uiPriority="9" w:semiHidden="1" w:unhideWhenUsed="1" w:qFormat="1"/>
+    <w:lsdException w:name="heading 3" w:uiPriority="9" w:semiHidden="1" w:unhideWhenUsed="1" w:qFormat="1"/>
+    <w:lsdException w:name="heading 4" w:uiPriority="9" w:semiHidden="1" w:unhideWhenUsed="1" w:qFormat="1"/>
+    <w:lsdException w:name="heading 5" w:uiPriority="9" w:semiHidden="1" w:unhideWhenUsed="1" w:qFormat="1"/>
+    <w:lsdException w:name="heading 6" w:uiPriority="9" w:semiHidden="1" w:unhideWhenUsed="1" w:qFormat="1"/>
+    <w:lsdException w:name="heading 7" w:uiPriority="9" w:semiHidden="1" w:unhideWhenUsed="1" w:qFormat="1"/>
+    <w:lsdException w:name="heading 8" w:uiPriority="9" w:semiHidden="1" w:unhideWhenUsed="1" w:qFormat="1"/>
+    <w:lsdException w:name="heading 9" w:uiPriority="9" w:semiHidden="1" w:unhideWhenUsed="1" w:qFormat="1"/>
     <w:lsdException w:name="index 1" w:semiHidden="1" w:unhideWhenUsed="1"/>
     <w:lsdException w:name="index 2" w:semiHidden="1" w:unhideWhenUsed="1"/>
     <w:lsdException w:name="index 3" w:semiHidden="1" w:unhideWhenUsed="1"/>
@@ -7441,22 +7533,22 @@
     <w:lsdException w:name="index 7" w:semiHidden="1" w:unhideWhenUsed="1"/>
     <w:lsdException w:name="index 8" w:semiHidden="1" w:unhideWhenUsed="1"/>
     <w:lsdException w:name="index 9" w:semiHidden="1" w:unhideWhenUsed="1"/>
-    <w:lsdException w:name="toc 1" w:semiHidden="1" w:uiPriority="39" w:unhideWhenUsed="1"/>
-    <w:lsdException w:name="toc 2" w:semiHidden="1" w:uiPriority="39" w:unhideWhenUsed="1"/>
-    <w:lsdException w:name="toc 3" w:semiHidden="1" w:uiPriority="39" w:unhideWhenUsed="1"/>
-    <w:lsdException w:name="toc 4" w:semiHidden="1" w:uiPriority="39" w:unhideWhenUsed="1"/>
-    <w:lsdException w:name="toc 5" w:semiHidden="1" w:uiPriority="39" w:unhideWhenUsed="1"/>
-    <w:lsdException w:name="toc 6" w:semiHidden="1" w:uiPriority="39" w:unhideWhenUsed="1"/>
-    <w:lsdException w:name="toc 7" w:semiHidden="1" w:uiPriority="39" w:unhideWhenUsed="1"/>
-    <w:lsdException w:name="toc 8" w:semiHidden="1" w:uiPriority="39" w:unhideWhenUsed="1"/>
-    <w:lsdException w:name="toc 9" w:semiHidden="1" w:uiPriority="39" w:unhideWhenUsed="1"/>
+    <w:lsdException w:name="toc 1" w:uiPriority="39" w:semiHidden="1" w:unhideWhenUsed="1"/>
+    <w:lsdException w:name="toc 2" w:uiPriority="39" w:semiHidden="1" w:unhideWhenUsed="1"/>
+    <w:lsdException w:name="toc 3" w:uiPriority="39" w:semiHidden="1" w:unhideWhenUsed="1"/>
+    <w:lsdException w:name="toc 4" w:uiPriority="39" w:semiHidden="1" w:unhideWhenUsed="1"/>
+    <w:lsdException w:name="toc 5" w:uiPriority="39" w:semiHidden="1" w:unhideWhenUsed="1"/>
+    <w:lsdException w:name="toc 6" w:uiPriority="39" w:semiHidden="1" w:unhideWhenUsed="1"/>
+    <w:lsdException w:name="toc 7" w:uiPriority="39" w:semiHidden="1" w:unhideWhenUsed="1"/>
+    <w:lsdException w:name="toc 8" w:uiPriority="39" w:semiHidden="1" w:unhideWhenUsed="1"/>
+    <w:lsdException w:name="toc 9" w:uiPriority="39" w:semiHidden="1" w:unhideWhenUsed="1"/>
     <w:lsdException w:name="Normal Indent" w:semiHidden="1" w:unhideWhenUsed="1"/>
     <w:lsdException w:name="footnote text" w:semiHidden="1" w:unhideWhenUsed="1"/>
     <w:lsdException w:name="annotation text" w:semiHidden="1" w:unhideWhenUsed="1"/>
     <w:lsdException w:name="header" w:semiHidden="1" w:unhideWhenUsed="1"/>
     <w:lsdException w:name="footer" w:semiHidden="1" w:unhideWhenUsed="1"/>
     <w:lsdException w:name="index heading" w:semiHidden="1" w:unhideWhenUsed="1"/>
-    <w:lsdException w:name="caption" w:semiHidden="1" w:uiPriority="35" w:unhideWhenUsed="1" w:qFormat="1"/>
+    <w:lsdException w:name="caption" w:uiPriority="35" w:semiHidden="1" w:unhideWhenUsed="1" w:qFormat="1"/>
     <w:lsdException w:name="table of figures" w:semiHidden="1" w:unhideWhenUsed="1"/>
     <w:lsdException w:name="envelope address" w:semiHidden="1" w:unhideWhenUsed="1"/>
     <w:lsdException w:name="envelope return" w:semiHidden="1" w:unhideWhenUsed="1"/>
@@ -7487,7 +7579,7 @@
     <w:lsdException w:name="Title" w:uiPriority="10" w:qFormat="1"/>
     <w:lsdException w:name="Closing" w:semiHidden="1" w:unhideWhenUsed="1"/>
     <w:lsdException w:name="Signature" w:semiHidden="1" w:unhideWhenUsed="1"/>
-    <w:lsdException w:name="Default Paragraph Font" w:semiHidden="1" w:uiPriority="1" w:unhideWhenUsed="1"/>
+    <w:lsdException w:name="Default Paragraph Font" w:uiPriority="1" w:semiHidden="1" w:unhideWhenUsed="1"/>
     <w:lsdException w:name="Body Text" w:semiHidden="1" w:unhideWhenUsed="1"/>
     <w:lsdException w:name="Body Text Indent" w:semiHidden="1" w:unhideWhenUsed="1"/>
     <w:lsdException w:name="List Continue" w:semiHidden="1" w:unhideWhenUsed="1"/>
@@ -7687,8 +7779,8 @@
     <w:lsdException w:name="Subtle Reference" w:uiPriority="31" w:qFormat="1"/>
     <w:lsdException w:name="Intense Reference" w:uiPriority="32" w:qFormat="1"/>
     <w:lsdException w:name="Book Title" w:uiPriority="33" w:qFormat="1"/>
-    <w:lsdException w:name="Bibliography" w:semiHidden="1" w:uiPriority="37" w:unhideWhenUsed="1"/>
-    <w:lsdException w:name="TOC Heading" w:semiHidden="1" w:uiPriority="39" w:unhideWhenUsed="1" w:qFormat="1"/>
+    <w:lsdException w:name="Bibliography" w:uiPriority="37" w:semiHidden="1" w:unhideWhenUsed="1"/>
+    <w:lsdException w:name="TOC Heading" w:uiPriority="39" w:semiHidden="1" w:unhideWhenUsed="1" w:qFormat="1"/>
     <w:lsdException w:name="Plain Table 1" w:uiPriority="41"/>
     <w:lsdException w:name="Plain Table 2" w:uiPriority="42"/>
     <w:lsdException w:name="Plain Table 3" w:uiPriority="43"/>
@@ -7799,7 +7891,7 @@
     <w:lsdException w:name="Unresolved Mention" w:semiHidden="1" w:unhideWhenUsed="1"/>
     <w:lsdException w:name="Smart Link" w:semiHidden="1" w:unhideWhenUsed="1"/>
   </w:latentStyles>
-  <w:style w:type="paragraph" w:default="1" w:styleId="Norml">
+  <w:style w:type="paragraph" w:styleId="Norml" w:default="1">
     <w:name w:val="Normal"/>
     <w:qFormat/>
     <w:rsid w:val="00405ECF"/>
@@ -7824,7 +7916,7 @@
       <w:outlineLvl w:val="0"/>
     </w:pPr>
     <w:rPr>
-      <w:rFonts w:ascii="Spectral Medium" w:eastAsiaTheme="majorEastAsia" w:hAnsi="Spectral Medium" w:cstheme="majorBidi"/>
+      <w:rFonts w:ascii="Spectral Medium" w:hAnsi="Spectral Medium" w:eastAsiaTheme="majorEastAsia" w:cstheme="majorBidi"/>
       <w:smallCaps/>
       <w:color w:val="2E74B5" w:themeColor="accent1" w:themeShade="BF"/>
       <w:sz w:val="32"/>
@@ -7847,7 +7939,7 @@
       <w:outlineLvl w:val="1"/>
     </w:pPr>
     <w:rPr>
-      <w:rFonts w:ascii="Spectral Medium" w:eastAsiaTheme="majorEastAsia" w:hAnsi="Spectral Medium" w:cstheme="majorBidi"/>
+      <w:rFonts w:ascii="Spectral Medium" w:hAnsi="Spectral Medium" w:eastAsiaTheme="majorEastAsia" w:cstheme="majorBidi"/>
       <w:color w:val="1F4E79" w:themeColor="accent1" w:themeShade="80"/>
       <w:sz w:val="26"/>
       <w:szCs w:val="26"/>
@@ -7868,19 +7960,19 @@
       <w:outlineLvl w:val="2"/>
     </w:pPr>
     <w:rPr>
-      <w:rFonts w:ascii="Spectral Light" w:eastAsiaTheme="majorEastAsia" w:hAnsi="Spectral Light" w:cstheme="majorBidi"/>
+      <w:rFonts w:ascii="Spectral Light" w:hAnsi="Spectral Light" w:eastAsiaTheme="majorEastAsia" w:cstheme="majorBidi"/>
       <w:color w:val="323E4F" w:themeColor="text2" w:themeShade="BF"/>
       <w:sz w:val="24"/>
       <w:szCs w:val="24"/>
     </w:rPr>
   </w:style>
-  <w:style w:type="character" w:default="1" w:styleId="Bekezdsalapbettpusa">
+  <w:style w:type="character" w:styleId="Bekezdsalapbettpusa" w:default="1">
     <w:name w:val="Default Paragraph Font"/>
     <w:uiPriority w:val="1"/>
     <w:semiHidden/>
     <w:unhideWhenUsed/>
   </w:style>
-  <w:style w:type="table" w:default="1" w:styleId="Normltblzat">
+  <w:style w:type="table" w:styleId="Normltblzat" w:default="1">
     <w:name w:val="Normal Table"/>
     <w:uiPriority w:val="99"/>
     <w:semiHidden/>
@@ -7895,7 +7987,7 @@
       </w:tblCellMar>
     </w:tblPr>
   </w:style>
-  <w:style w:type="numbering" w:default="1" w:styleId="Nemlista">
+  <w:style w:type="numbering" w:styleId="Nemlista" w:default="1">
     <w:name w:val="No List"/>
     <w:uiPriority w:val="99"/>
     <w:semiHidden/>
@@ -7915,7 +8007,7 @@
       <w:jc w:val="center"/>
     </w:pPr>
     <w:rPr>
-      <w:rFonts w:ascii="Spectral Medium" w:eastAsiaTheme="majorEastAsia" w:hAnsi="Spectral Medium" w:cstheme="majorBidi"/>
+      <w:rFonts w:ascii="Spectral Medium" w:hAnsi="Spectral Medium" w:eastAsiaTheme="majorEastAsia" w:cstheme="majorBidi"/>
       <w:smallCaps/>
       <w:spacing w:val="40"/>
       <w:kern w:val="28"/>
@@ -7923,14 +8015,14 @@
       <w:szCs w:val="56"/>
     </w:rPr>
   </w:style>
-  <w:style w:type="character" w:customStyle="1" w:styleId="CmChar">
+  <w:style w:type="character" w:styleId="CmChar" w:customStyle="1">
     <w:name w:val="Cím Char"/>
     <w:basedOn w:val="Bekezdsalapbettpusa"/>
     <w:link w:val="Cm"/>
     <w:uiPriority w:val="10"/>
     <w:rsid w:val="00DA3689"/>
     <w:rPr>
-      <w:rFonts w:ascii="Spectral Medium" w:eastAsiaTheme="majorEastAsia" w:hAnsi="Spectral Medium" w:cstheme="majorBidi"/>
+      <w:rFonts w:ascii="Spectral Medium" w:hAnsi="Spectral Medium" w:eastAsiaTheme="majorEastAsia" w:cstheme="majorBidi"/>
       <w:smallCaps/>
       <w:spacing w:val="40"/>
       <w:kern w:val="28"/>
@@ -7952,24 +8044,24 @@
       </w:numPr>
     </w:pPr>
     <w:rPr>
-      <w:rFonts w:ascii="Spectral Light" w:eastAsiaTheme="minorEastAsia" w:hAnsi="Spectral Light"/>
+      <w:rFonts w:ascii="Spectral Light" w:hAnsi="Spectral Light" w:eastAsiaTheme="minorEastAsia"/>
       <w:color w:val="5A5A5A" w:themeColor="text1" w:themeTint="A5"/>
       <w:spacing w:val="15"/>
     </w:rPr>
   </w:style>
-  <w:style w:type="character" w:customStyle="1" w:styleId="AlcmChar">
+  <w:style w:type="character" w:styleId="AlcmChar" w:customStyle="1">
     <w:name w:val="Alcím Char"/>
     <w:basedOn w:val="Bekezdsalapbettpusa"/>
     <w:link w:val="Alcm"/>
     <w:uiPriority w:val="11"/>
     <w:rsid w:val="00DA3689"/>
     <w:rPr>
-      <w:rFonts w:ascii="Spectral Light" w:eastAsiaTheme="minorEastAsia" w:hAnsi="Spectral Light"/>
+      <w:rFonts w:ascii="Spectral Light" w:hAnsi="Spectral Light" w:eastAsiaTheme="minorEastAsia"/>
       <w:color w:val="5A5A5A" w:themeColor="text1" w:themeTint="A5"/>
       <w:spacing w:val="15"/>
     </w:rPr>
   </w:style>
-  <w:style w:type="paragraph" w:customStyle="1" w:styleId="Szerzk">
+  <w:style w:type="paragraph" w:styleId="Szerzk" w:customStyle="1">
     <w:name w:val="Szerzők"/>
     <w:next w:val="Norml"/>
     <w:qFormat/>
@@ -8127,28 +8219,28 @@
       <w:rFonts w:cstheme="minorHAnsi"/>
     </w:rPr>
   </w:style>
-  <w:style w:type="character" w:customStyle="1" w:styleId="Cmsor1Char">
+  <w:style w:type="character" w:styleId="Cmsor1Char" w:customStyle="1">
     <w:name w:val="Címsor 1 Char"/>
     <w:basedOn w:val="Bekezdsalapbettpusa"/>
     <w:link w:val="Cmsor1"/>
     <w:uiPriority w:val="9"/>
     <w:rsid w:val="00421267"/>
     <w:rPr>
-      <w:rFonts w:ascii="Spectral Medium" w:eastAsiaTheme="majorEastAsia" w:hAnsi="Spectral Medium" w:cstheme="majorBidi"/>
+      <w:rFonts w:ascii="Spectral Medium" w:hAnsi="Spectral Medium" w:eastAsiaTheme="majorEastAsia" w:cstheme="majorBidi"/>
       <w:smallCaps/>
       <w:color w:val="2E74B5" w:themeColor="accent1" w:themeShade="BF"/>
       <w:sz w:val="32"/>
       <w:szCs w:val="32"/>
     </w:rPr>
   </w:style>
-  <w:style w:type="character" w:customStyle="1" w:styleId="Cmsor2Char">
+  <w:style w:type="character" w:styleId="Cmsor2Char" w:customStyle="1">
     <w:name w:val="Címsor 2 Char"/>
     <w:basedOn w:val="Bekezdsalapbettpusa"/>
     <w:link w:val="Cmsor2"/>
     <w:uiPriority w:val="9"/>
     <w:rsid w:val="00421267"/>
     <w:rPr>
-      <w:rFonts w:ascii="Spectral Medium" w:eastAsiaTheme="majorEastAsia" w:hAnsi="Spectral Medium" w:cstheme="majorBidi"/>
+      <w:rFonts w:ascii="Spectral Medium" w:hAnsi="Spectral Medium" w:eastAsiaTheme="majorEastAsia" w:cstheme="majorBidi"/>
       <w:color w:val="1F4E79" w:themeColor="accent1" w:themeShade="80"/>
       <w:sz w:val="26"/>
       <w:szCs w:val="26"/>
@@ -8176,7 +8268,7 @@
       <w:u w:val="single"/>
     </w:rPr>
   </w:style>
-  <w:style w:type="paragraph" w:customStyle="1" w:styleId="Kd">
+  <w:style w:type="paragraph" w:styleId="Kd" w:customStyle="1">
     <w:name w:val="Kód"/>
     <w:link w:val="KdChar"/>
     <w:qFormat/>
@@ -8188,7 +8280,7 @@
       <w:lang w:val="en-US"/>
     </w:rPr>
   </w:style>
-  <w:style w:type="character" w:customStyle="1" w:styleId="KdChar">
+  <w:style w:type="character" w:styleId="KdChar" w:customStyle="1">
     <w:name w:val="Kód Char"/>
     <w:basedOn w:val="Bekezdsalapbettpusa"/>
     <w:link w:val="Kd"/>
@@ -8200,19 +8292,19 @@
       <w:lang w:val="en-US"/>
     </w:rPr>
   </w:style>
-  <w:style w:type="paragraph" w:customStyle="1" w:styleId="Kdblokk">
+  <w:style w:type="paragraph" w:styleId="Kdblokk" w:customStyle="1">
     <w:name w:val="Kódblokk"/>
     <w:basedOn w:val="Kd"/>
     <w:link w:val="KdblokkChar"/>
     <w:qFormat/>
     <w:rsid w:val="00913383"/>
     <w:pPr>
-      <w:framePr w:wrap="notBeside" w:vAnchor="text" w:hAnchor="text" w:y="1"/>
+      <w:framePr w:wrap="notBeside" w:hAnchor="text" w:vAnchor="text" w:y="1"/>
       <w:pBdr>
-        <w:top w:val="single" w:sz="6" w:space="1" w:color="auto"/>
-        <w:left w:val="single" w:sz="6" w:space="4" w:color="auto"/>
-        <w:bottom w:val="single" w:sz="6" w:space="1" w:color="auto"/>
-        <w:right w:val="single" w:sz="6" w:space="4" w:color="auto"/>
+        <w:top w:val="single" w:color="auto" w:sz="6" w:space="1"/>
+        <w:left w:val="single" w:color="auto" w:sz="6" w:space="4"/>
+        <w:bottom w:val="single" w:color="auto" w:sz="6" w:space="1"/>
+        <w:right w:val="single" w:color="auto" w:sz="6" w:space="4"/>
       </w:pBdr>
       <w:shd w:val="clear" w:color="auto" w:fill="404040" w:themeFill="text1" w:themeFillTint="BF"/>
       <w:spacing w:after="0"/>
@@ -8222,7 +8314,7 @@
       <w:color w:val="D9D9D9" w:themeColor="background1" w:themeShade="D9"/>
     </w:rPr>
   </w:style>
-  <w:style w:type="character" w:customStyle="1" w:styleId="KdblokkChar">
+  <w:style w:type="character" w:styleId="KdblokkChar" w:customStyle="1">
     <w:name w:val="Kódblokk Char"/>
     <w:basedOn w:val="KdChar"/>
     <w:link w:val="Kdblokk"/>
@@ -8245,12 +8337,12 @@
     </w:pPr>
     <w:tblPr>
       <w:tblBorders>
-        <w:top w:val="single" w:sz="4" w:space="0" w:color="auto"/>
-        <w:left w:val="single" w:sz="4" w:space="0" w:color="auto"/>
-        <w:bottom w:val="single" w:sz="4" w:space="0" w:color="auto"/>
-        <w:right w:val="single" w:sz="4" w:space="0" w:color="auto"/>
-        <w:insideH w:val="single" w:sz="4" w:space="0" w:color="auto"/>
-        <w:insideV w:val="single" w:sz="4" w:space="0" w:color="auto"/>
+        <w:top w:val="single" w:color="auto" w:sz="4" w:space="0"/>
+        <w:left w:val="single" w:color="auto" w:sz="4" w:space="0"/>
+        <w:bottom w:val="single" w:color="auto" w:sz="4" w:space="0"/>
+        <w:right w:val="single" w:color="auto" w:sz="4" w:space="0"/>
+        <w:insideH w:val="single" w:color="auto" w:sz="4" w:space="0"/>
+        <w:insideV w:val="single" w:color="auto" w:sz="4" w:space="0"/>
       </w:tblBorders>
     </w:tblPr>
   </w:style>
@@ -8266,12 +8358,12 @@
       <w:tblStyleRowBandSize w:val="1"/>
       <w:tblStyleColBandSize w:val="1"/>
       <w:tblBorders>
-        <w:top w:val="single" w:sz="4" w:space="0" w:color="FFFFFF" w:themeColor="background1"/>
-        <w:left w:val="single" w:sz="4" w:space="0" w:color="FFFFFF" w:themeColor="background1"/>
-        <w:bottom w:val="single" w:sz="4" w:space="0" w:color="FFFFFF" w:themeColor="background1"/>
-        <w:right w:val="single" w:sz="4" w:space="0" w:color="FFFFFF" w:themeColor="background1"/>
-        <w:insideH w:val="single" w:sz="4" w:space="0" w:color="FFFFFF" w:themeColor="background1"/>
-        <w:insideV w:val="single" w:sz="4" w:space="0" w:color="FFFFFF" w:themeColor="background1"/>
+        <w:top w:val="single" w:color="FFFFFF" w:themeColor="background1" w:sz="4" w:space="0"/>
+        <w:left w:val="single" w:color="FFFFFF" w:themeColor="background1" w:sz="4" w:space="0"/>
+        <w:bottom w:val="single" w:color="FFFFFF" w:themeColor="background1" w:sz="4" w:space="0"/>
+        <w:right w:val="single" w:color="FFFFFF" w:themeColor="background1" w:sz="4" w:space="0"/>
+        <w:insideH w:val="single" w:color="FFFFFF" w:themeColor="background1" w:sz="4" w:space="0"/>
+        <w:insideV w:val="single" w:color="FFFFFF" w:themeColor="background1" w:sz="4" w:space="0"/>
       </w:tblBorders>
     </w:tblPr>
     <w:tcPr>
@@ -8286,9 +8378,9 @@
       <w:tblPr/>
       <w:tcPr>
         <w:tcBorders>
-          <w:top w:val="single" w:sz="4" w:space="0" w:color="FFFFFF" w:themeColor="background1"/>
-          <w:left w:val="single" w:sz="4" w:space="0" w:color="FFFFFF" w:themeColor="background1"/>
-          <w:right w:val="single" w:sz="4" w:space="0" w:color="FFFFFF" w:themeColor="background1"/>
+          <w:top w:val="single" w:color="FFFFFF" w:themeColor="background1" w:sz="4" w:space="0"/>
+          <w:left w:val="single" w:color="FFFFFF" w:themeColor="background1" w:sz="4" w:space="0"/>
+          <w:right w:val="single" w:color="FFFFFF" w:themeColor="background1" w:sz="4" w:space="0"/>
           <w:insideH w:val="nil"/>
           <w:insideV w:val="nil"/>
         </w:tcBorders>
@@ -8304,9 +8396,9 @@
       <w:tblPr/>
       <w:tcPr>
         <w:tcBorders>
-          <w:left w:val="single" w:sz="4" w:space="0" w:color="FFFFFF" w:themeColor="background1"/>
-          <w:bottom w:val="single" w:sz="4" w:space="0" w:color="FFFFFF" w:themeColor="background1"/>
-          <w:right w:val="single" w:sz="4" w:space="0" w:color="FFFFFF" w:themeColor="background1"/>
+          <w:left w:val="single" w:color="FFFFFF" w:themeColor="background1" w:sz="4" w:space="0"/>
+          <w:bottom w:val="single" w:color="FFFFFF" w:themeColor="background1" w:sz="4" w:space="0"/>
+          <w:right w:val="single" w:color="FFFFFF" w:themeColor="background1" w:sz="4" w:space="0"/>
           <w:insideH w:val="nil"/>
           <w:insideV w:val="nil"/>
         </w:tcBorders>
@@ -8322,9 +8414,9 @@
       <w:tblPr/>
       <w:tcPr>
         <w:tcBorders>
-          <w:top w:val="single" w:sz="4" w:space="0" w:color="FFFFFF" w:themeColor="background1"/>
-          <w:left w:val="single" w:sz="4" w:space="0" w:color="FFFFFF" w:themeColor="background1"/>
-          <w:bottom w:val="single" w:sz="4" w:space="0" w:color="FFFFFF" w:themeColor="background1"/>
+          <w:top w:val="single" w:color="FFFFFF" w:themeColor="background1" w:sz="4" w:space="0"/>
+          <w:left w:val="single" w:color="FFFFFF" w:themeColor="background1" w:sz="4" w:space="0"/>
+          <w:bottom w:val="single" w:color="FFFFFF" w:themeColor="background1" w:sz="4" w:space="0"/>
           <w:insideV w:val="nil"/>
         </w:tcBorders>
         <w:shd w:val="clear" w:color="auto" w:fill="4472C4" w:themeFill="accent5"/>
@@ -8339,9 +8431,9 @@
       <w:tblPr/>
       <w:tcPr>
         <w:tcBorders>
-          <w:top w:val="single" w:sz="4" w:space="0" w:color="FFFFFF" w:themeColor="background1"/>
-          <w:bottom w:val="single" w:sz="4" w:space="0" w:color="FFFFFF" w:themeColor="background1"/>
-          <w:right w:val="single" w:sz="4" w:space="0" w:color="FFFFFF" w:themeColor="background1"/>
+          <w:top w:val="single" w:color="FFFFFF" w:themeColor="background1" w:sz="4" w:space="0"/>
+          <w:bottom w:val="single" w:color="FFFFFF" w:themeColor="background1" w:sz="4" w:space="0"/>
+          <w:right w:val="single" w:color="FFFFFF" w:themeColor="background1" w:sz="4" w:space="0"/>
           <w:insideV w:val="nil"/>
         </w:tcBorders>
         <w:shd w:val="clear" w:color="auto" w:fill="4472C4" w:themeFill="accent5"/>
@@ -8377,7 +8469,7 @@
     </w:tblPr>
     <w:tblStylePr w:type="firstRow">
       <w:rPr>
-        <w:rFonts w:asciiTheme="majorHAnsi" w:eastAsiaTheme="majorEastAsia" w:hAnsiTheme="majorHAnsi" w:cstheme="majorBidi"/>
+        <w:rFonts w:asciiTheme="majorHAnsi" w:hAnsiTheme="majorHAnsi" w:eastAsiaTheme="majorEastAsia" w:cstheme="majorBidi"/>
         <w:i/>
         <w:iCs/>
         <w:sz w:val="26"/>
@@ -8385,14 +8477,14 @@
       <w:tblPr/>
       <w:tcPr>
         <w:tcBorders>
-          <w:bottom w:val="single" w:sz="4" w:space="0" w:color="5B9BD5" w:themeColor="accent1"/>
+          <w:bottom w:val="single" w:color="5B9BD5" w:themeColor="accent1" w:sz="4" w:space="0"/>
         </w:tcBorders>
         <w:shd w:val="clear" w:color="auto" w:fill="FFFFFF" w:themeFill="background1"/>
       </w:tcPr>
     </w:tblStylePr>
     <w:tblStylePr w:type="lastRow">
       <w:rPr>
-        <w:rFonts w:asciiTheme="majorHAnsi" w:eastAsiaTheme="majorEastAsia" w:hAnsiTheme="majorHAnsi" w:cstheme="majorBidi"/>
+        <w:rFonts w:asciiTheme="majorHAnsi" w:hAnsiTheme="majorHAnsi" w:eastAsiaTheme="majorEastAsia" w:cstheme="majorBidi"/>
         <w:i/>
         <w:iCs/>
         <w:sz w:val="26"/>
@@ -8400,7 +8492,7 @@
       <w:tblPr/>
       <w:tcPr>
         <w:tcBorders>
-          <w:top w:val="single" w:sz="4" w:space="0" w:color="5B9BD5" w:themeColor="accent1"/>
+          <w:top w:val="single" w:color="5B9BD5" w:themeColor="accent1" w:sz="4" w:space="0"/>
         </w:tcBorders>
         <w:shd w:val="clear" w:color="auto" w:fill="FFFFFF" w:themeFill="background1"/>
       </w:tcPr>
@@ -8410,7 +8502,7 @@
         <w:jc w:val="right"/>
       </w:pPr>
       <w:rPr>
-        <w:rFonts w:asciiTheme="majorHAnsi" w:eastAsiaTheme="majorEastAsia" w:hAnsiTheme="majorHAnsi" w:cstheme="majorBidi"/>
+        <w:rFonts w:asciiTheme="majorHAnsi" w:hAnsiTheme="majorHAnsi" w:eastAsiaTheme="majorEastAsia" w:cstheme="majorBidi"/>
         <w:i/>
         <w:iCs/>
         <w:sz w:val="26"/>
@@ -8418,14 +8510,14 @@
       <w:tblPr/>
       <w:tcPr>
         <w:tcBorders>
-          <w:right w:val="single" w:sz="4" w:space="0" w:color="5B9BD5" w:themeColor="accent1"/>
+          <w:right w:val="single" w:color="5B9BD5" w:themeColor="accent1" w:sz="4" w:space="0"/>
         </w:tcBorders>
         <w:shd w:val="clear" w:color="auto" w:fill="FFFFFF" w:themeFill="background1"/>
       </w:tcPr>
     </w:tblStylePr>
     <w:tblStylePr w:type="lastCol">
       <w:rPr>
-        <w:rFonts w:asciiTheme="majorHAnsi" w:eastAsiaTheme="majorEastAsia" w:hAnsiTheme="majorHAnsi" w:cstheme="majorBidi"/>
+        <w:rFonts w:asciiTheme="majorHAnsi" w:hAnsiTheme="majorHAnsi" w:eastAsiaTheme="majorEastAsia" w:cstheme="majorBidi"/>
         <w:i/>
         <w:iCs/>
         <w:sz w:val="26"/>
@@ -8433,7 +8525,7 @@
       <w:tblPr/>
       <w:tcPr>
         <w:tcBorders>
-          <w:left w:val="single" w:sz="4" w:space="0" w:color="5B9BD5" w:themeColor="accent1"/>
+          <w:left w:val="single" w:color="5B9BD5" w:themeColor="accent1" w:sz="4" w:space="0"/>
         </w:tcBorders>
         <w:shd w:val="clear" w:color="auto" w:fill="FFFFFF" w:themeFill="background1"/>
       </w:tcPr>
@@ -8483,14 +8575,14 @@
       </w:tcPr>
     </w:tblStylePr>
   </w:style>
-  <w:style w:type="character" w:customStyle="1" w:styleId="Cmsor3Char">
+  <w:style w:type="character" w:styleId="Cmsor3Char" w:customStyle="1">
     <w:name w:val="Címsor 3 Char"/>
     <w:basedOn w:val="Bekezdsalapbettpusa"/>
     <w:link w:val="Cmsor3"/>
     <w:uiPriority w:val="9"/>
     <w:rsid w:val="00214E23"/>
     <w:rPr>
-      <w:rFonts w:ascii="Spectral Light" w:eastAsiaTheme="majorEastAsia" w:hAnsi="Spectral Light" w:cstheme="majorBidi"/>
+      <w:rFonts w:ascii="Spectral Light" w:hAnsi="Spectral Light" w:eastAsiaTheme="majorEastAsia" w:cstheme="majorBidi"/>
       <w:color w:val="323E4F" w:themeColor="text2" w:themeShade="BF"/>
       <w:sz w:val="24"/>
       <w:szCs w:val="24"/>
@@ -8518,10 +8610,10 @@
       <w:tblStyleRowBandSize w:val="1"/>
       <w:tblStyleColBandSize w:val="1"/>
       <w:tblBorders>
-        <w:top w:val="single" w:sz="4" w:space="0" w:color="4472C4" w:themeColor="accent5"/>
-        <w:left w:val="single" w:sz="4" w:space="0" w:color="4472C4" w:themeColor="accent5"/>
-        <w:bottom w:val="single" w:sz="4" w:space="0" w:color="4472C4" w:themeColor="accent5"/>
-        <w:right w:val="single" w:sz="4" w:space="0" w:color="4472C4" w:themeColor="accent5"/>
+        <w:top w:val="single" w:color="4472C4" w:themeColor="accent5" w:sz="4" w:space="0"/>
+        <w:left w:val="single" w:color="4472C4" w:themeColor="accent5" w:sz="4" w:space="0"/>
+        <w:bottom w:val="single" w:color="4472C4" w:themeColor="accent5" w:sz="4" w:space="0"/>
+        <w:right w:val="single" w:color="4472C4" w:themeColor="accent5" w:sz="4" w:space="0"/>
       </w:tblBorders>
     </w:tblPr>
     <w:tblStylePr w:type="firstRow">
@@ -8543,7 +8635,7 @@
       <w:tblPr/>
       <w:tcPr>
         <w:tcBorders>
-          <w:top w:val="double" w:sz="4" w:space="0" w:color="4472C4" w:themeColor="accent5"/>
+          <w:top w:val="double" w:color="4472C4" w:themeColor="accent5" w:sz="4" w:space="0"/>
         </w:tcBorders>
         <w:shd w:val="clear" w:color="auto" w:fill="FFFFFF" w:themeFill="background1"/>
       </w:tcPr>
@@ -8578,8 +8670,8 @@
       <w:tblPr/>
       <w:tcPr>
         <w:tcBorders>
-          <w:left w:val="single" w:sz="4" w:space="0" w:color="4472C4" w:themeColor="accent5"/>
-          <w:right w:val="single" w:sz="4" w:space="0" w:color="4472C4" w:themeColor="accent5"/>
+          <w:left w:val="single" w:color="4472C4" w:themeColor="accent5" w:sz="4" w:space="0"/>
+          <w:right w:val="single" w:color="4472C4" w:themeColor="accent5" w:sz="4" w:space="0"/>
         </w:tcBorders>
       </w:tcPr>
     </w:tblStylePr>
@@ -8587,8 +8679,8 @@
       <w:tblPr/>
       <w:tcPr>
         <w:tcBorders>
-          <w:top w:val="single" w:sz="4" w:space="0" w:color="4472C4" w:themeColor="accent5"/>
-          <w:bottom w:val="single" w:sz="4" w:space="0" w:color="4472C4" w:themeColor="accent5"/>
+          <w:top w:val="single" w:color="4472C4" w:themeColor="accent5" w:sz="4" w:space="0"/>
+          <w:bottom w:val="single" w:color="4472C4" w:themeColor="accent5" w:sz="4" w:space="0"/>
           <w:insideH w:val="nil"/>
         </w:tcBorders>
       </w:tcPr>
@@ -8615,7 +8707,7 @@
       <w:tblPr/>
       <w:tcPr>
         <w:tcBorders>
-          <w:top w:val="double" w:sz="4" w:space="0" w:color="4472C4" w:themeColor="accent5"/>
+          <w:top w:val="double" w:color="4472C4" w:themeColor="accent5" w:sz="4" w:space="0"/>
           <w:left w:val="nil"/>
         </w:tcBorders>
       </w:tcPr>
@@ -8624,7 +8716,7 @@
       <w:tblPr/>
       <w:tcPr>
         <w:tcBorders>
-          <w:top w:val="double" w:sz="4" w:space="0" w:color="4472C4" w:themeColor="accent5"/>
+          <w:top w:val="double" w:color="4472C4" w:themeColor="accent5" w:sz="4" w:space="0"/>
           <w:right w:val="nil"/>
         </w:tcBorders>
       </w:tcPr>
@@ -8642,11 +8734,11 @@
       <w:tblStyleRowBandSize w:val="1"/>
       <w:tblStyleColBandSize w:val="1"/>
       <w:tblBorders>
-        <w:top w:val="single" w:sz="4" w:space="0" w:color="8EAADB" w:themeColor="accent5" w:themeTint="99"/>
-        <w:left w:val="single" w:sz="4" w:space="0" w:color="8EAADB" w:themeColor="accent5" w:themeTint="99"/>
-        <w:bottom w:val="single" w:sz="4" w:space="0" w:color="8EAADB" w:themeColor="accent5" w:themeTint="99"/>
-        <w:right w:val="single" w:sz="4" w:space="0" w:color="8EAADB" w:themeColor="accent5" w:themeTint="99"/>
-        <w:insideH w:val="single" w:sz="4" w:space="0" w:color="8EAADB" w:themeColor="accent5" w:themeTint="99"/>
+        <w:top w:val="single" w:color="8EAADB" w:themeColor="accent5" w:themeTint="99" w:sz="4" w:space="0"/>
+        <w:left w:val="single" w:color="8EAADB" w:themeColor="accent5" w:themeTint="99" w:sz="4" w:space="0"/>
+        <w:bottom w:val="single" w:color="8EAADB" w:themeColor="accent5" w:themeTint="99" w:sz="4" w:space="0"/>
+        <w:right w:val="single" w:color="8EAADB" w:themeColor="accent5" w:themeTint="99" w:sz="4" w:space="0"/>
+        <w:insideH w:val="single" w:color="8EAADB" w:themeColor="accent5" w:themeTint="99" w:sz="4" w:space="0"/>
       </w:tblBorders>
     </w:tblPr>
     <w:tblStylePr w:type="firstRow">
@@ -8658,10 +8750,10 @@
       <w:tblPr/>
       <w:tcPr>
         <w:tcBorders>
-          <w:top w:val="single" w:sz="4" w:space="0" w:color="4472C4" w:themeColor="accent5"/>
-          <w:left w:val="single" w:sz="4" w:space="0" w:color="4472C4" w:themeColor="accent5"/>
-          <w:bottom w:val="single" w:sz="4" w:space="0" w:color="4472C4" w:themeColor="accent5"/>
-          <w:right w:val="single" w:sz="4" w:space="0" w:color="4472C4" w:themeColor="accent5"/>
+          <w:top w:val="single" w:color="4472C4" w:themeColor="accent5" w:sz="4" w:space="0"/>
+          <w:left w:val="single" w:color="4472C4" w:themeColor="accent5" w:sz="4" w:space="0"/>
+          <w:bottom w:val="single" w:color="4472C4" w:themeColor="accent5" w:sz="4" w:space="0"/>
+          <w:right w:val="single" w:color="4472C4" w:themeColor="accent5" w:sz="4" w:space="0"/>
           <w:insideH w:val="nil"/>
         </w:tcBorders>
         <w:shd w:val="clear" w:color="auto" w:fill="4472C4" w:themeFill="accent5"/>
@@ -8675,7 +8767,7 @@
       <w:tblPr/>
       <w:tcPr>
         <w:tcBorders>
-          <w:top w:val="double" w:sz="4" w:space="0" w:color="8EAADB" w:themeColor="accent5" w:themeTint="99"/>
+          <w:top w:val="double" w:color="8EAADB" w:themeColor="accent5" w:themeTint="99" w:sz="4" w:space="0"/>
         </w:tcBorders>
       </w:tcPr>
     </w:tblStylePr>
@@ -8708,7 +8800,7 @@
 </file>
 
 <file path=word/theme/theme1.xml><?xml version="1.0" encoding="utf-8"?>
-<a:theme xmlns:a="http://schemas.openxmlformats.org/drawingml/2006/main" name="Office-téma">
+<a:theme xmlns:a="http://schemas.openxmlformats.org/drawingml/2006/main" xmlns:thm15="http://schemas.microsoft.com/office/thememl/2012/main" name="Office-téma">
   <a:themeElements>
     <a:clrScheme name="Office">
       <a:dk1>

</xml_diff>